<commit_message>
Full Rebuild, Rosh Chodesh in Yom Tov
</commit_message>
<xml_diff>
--- a/Files/06 - Yom Tov/10 - Yom Kippur/5785/Yom Kippur 5785.docx
+++ b/Files/06 - Yom Tov/10 - Yom Kippur/5785/Yom Kippur 5785.docx
@@ -12,7 +12,7 @@
         <w:rPr>
           <w:rFonts w:ascii="Times New Roman" w:hAnsi="Times New Roman" w:cs="Times New Roman"/>
         </w:rPr>
-        <w:t>Yom Kippur 5785</w:t>
+        <w:t>Yom Kipper 5785</w:t>
       </w:r>
     </w:p>
     <w:p>
@@ -79,6 +79,12 @@
         <w:rPr>
           <w:rFonts w:ascii="Times New Roman" w:hAnsi="Times New Roman" w:cs="Times New Roman"/>
         </w:rPr>
+        <w:t xml:space="preserve"> of Berditchev</w:t>
+      </w:r>
+      <w:r>
+        <w:rPr>
+          <w:rFonts w:ascii="Times New Roman" w:hAnsi="Times New Roman" w:cs="Times New Roman"/>
+        </w:rPr>
         <w:t xml:space="preserve"> quotes the famous </w:t>
       </w:r>
       <w:r>
@@ -294,7 +300,19 @@
         <w:rPr>
           <w:rFonts w:ascii="Times New Roman" w:hAnsi="Times New Roman" w:cs="Times New Roman"/>
         </w:rPr>
-        <w:t>had a very ingenious take on this, and it</w:t>
+        <w:t>had a</w:t>
+      </w:r>
+      <w:r>
+        <w:rPr>
+          <w:rFonts w:ascii="Times New Roman" w:hAnsi="Times New Roman" w:cs="Times New Roman"/>
+        </w:rPr>
+        <w:t>n</w:t>
+      </w:r>
+      <w:r>
+        <w:rPr>
+          <w:rFonts w:ascii="Times New Roman" w:hAnsi="Times New Roman" w:cs="Times New Roman"/>
+        </w:rPr>
+        <w:t xml:space="preserve"> ingenious take on this, and it</w:t>
       </w:r>
       <w:r>
         <w:rPr>
@@ -332,7 +350,19 @@
         <w:rPr>
           <w:rFonts w:ascii="Times New Roman" w:hAnsi="Times New Roman" w:cs="Times New Roman"/>
         </w:rPr>
-        <w:t xml:space="preserve">He says in the olden days, </w:t>
+        <w:t>He says</w:t>
+      </w:r>
+      <w:r>
+        <w:rPr>
+          <w:rFonts w:ascii="Times New Roman" w:hAnsi="Times New Roman" w:cs="Times New Roman"/>
+        </w:rPr>
+        <w:t>,</w:t>
+      </w:r>
+      <w:r>
+        <w:rPr>
+          <w:rFonts w:ascii="Times New Roman" w:hAnsi="Times New Roman" w:cs="Times New Roman"/>
+        </w:rPr>
+        <w:t xml:space="preserve"> in the olden days,</w:t>
       </w:r>
       <w:r>
         <w:rPr>
@@ -360,6 +390,12 @@
           <w:rFonts w:ascii="Times New Roman" w:hAnsi="Times New Roman" w:cs="Times New Roman"/>
           <w:rtl/>
         </w:rPr>
+        <w:t xml:space="preserve"> </w:t>
+      </w:r>
+      <w:r>
+        <w:rPr>
+          <w:rFonts w:ascii="Times New Roman" w:hAnsi="Times New Roman" w:cs="Times New Roman"/>
+        </w:rPr>
         <w:t xml:space="preserve">, </w:t>
       </w:r>
       <w:r>
@@ -401,7 +437,19 @@
         <w:rPr>
           <w:rFonts w:ascii="Times New Roman" w:hAnsi="Times New Roman" w:cs="Times New Roman"/>
         </w:rPr>
-        <w:t xml:space="preserve"> as I say in Yiddish, a person used to deal honestly in his business. He would do his business honestly, he did everything properly, and he never let out a lie from his mouth. That was in the in the old days. He would go into </w:t>
+        <w:t xml:space="preserve"> as </w:t>
+      </w:r>
+      <w:r>
+        <w:rPr>
+          <w:rFonts w:ascii="Times New Roman" w:hAnsi="Times New Roman" w:cs="Times New Roman"/>
+        </w:rPr>
+        <w:t>they</w:t>
+      </w:r>
+      <w:r>
+        <w:rPr>
+          <w:rFonts w:ascii="Times New Roman" w:hAnsi="Times New Roman" w:cs="Times New Roman"/>
+        </w:rPr>
+        <w:t xml:space="preserve"> say in Yiddish, a person used to deal honestly in his business. He would do his business honestly, he did everything properly, and he never let out a lie from his mouth. That was in the in the old days. He would go into </w:t>
       </w:r>
       <w:r>
         <w:rPr>
@@ -452,9 +500,8 @@
       <w:r>
         <w:rPr>
           <w:rFonts w:ascii="Times New Roman" w:hAnsi="Times New Roman" w:cs="Times New Roman"/>
-          <w:rtl/>
-        </w:rPr>
-        <w:t xml:space="preserve">, </w:t>
+        </w:rPr>
+        <w:t xml:space="preserve">: </w:t>
       </w:r>
       <w:r>
         <w:rPr>
@@ -606,7 +653,19 @@
         <w:rPr>
           <w:rFonts w:ascii="Times New Roman" w:hAnsi="Times New Roman" w:cs="Times New Roman"/>
         </w:rPr>
-        <w:t xml:space="preserve">. People cheat and lie and rob and steal as much as they possibly can to get away with making as much money as they can. And then what do they do? They go to </w:t>
+        <w:t>. People cheat and lie and rob and steal as much as they possibly can</w:t>
+      </w:r>
+      <w:r>
+        <w:rPr>
+          <w:rFonts w:ascii="Times New Roman" w:hAnsi="Times New Roman" w:cs="Times New Roman"/>
+        </w:rPr>
+        <w:t>,</w:t>
+      </w:r>
+      <w:r>
+        <w:rPr>
+          <w:rFonts w:ascii="Times New Roman" w:hAnsi="Times New Roman" w:cs="Times New Roman"/>
+        </w:rPr>
+        <w:t xml:space="preserve"> to get away with making as much money as they can. And then what do they do? They go to </w:t>
       </w:r>
       <w:r>
         <w:rPr>
@@ -1021,7 +1080,19 @@
         <w:rPr>
           <w:rFonts w:ascii="Times New Roman" w:hAnsi="Times New Roman" w:cs="Times New Roman"/>
         </w:rPr>
-        <w:t>. So it</w:t>
+        <w:t xml:space="preserve">. </w:t>
+      </w:r>
+      <w:r>
+        <w:rPr>
+          <w:rFonts w:ascii="Times New Roman" w:hAnsi="Times New Roman" w:cs="Times New Roman"/>
+        </w:rPr>
+        <w:t>I</w:t>
+      </w:r>
+      <w:r>
+        <w:rPr>
+          <w:rFonts w:ascii="Times New Roman" w:hAnsi="Times New Roman" w:cs="Times New Roman"/>
+        </w:rPr>
+        <w:t>t</w:t>
       </w:r>
       <w:r>
         <w:rPr>
@@ -1046,7 +1117,7 @@
         <w:rPr>
           <w:rFonts w:ascii="Times New Roman" w:hAnsi="Times New Roman" w:cs="Times New Roman"/>
         </w:rPr>
-        <w:t>, our responsibility and job to try to do something better, to try to make ourselves b</w:t>
+        <w:t>, to try to do something better, to try to make ourselves b</w:t>
       </w:r>
       <w:r>
         <w:rPr>
@@ -1211,7 +1282,415 @@
         <w:rPr>
           <w:rFonts w:ascii="Times New Roman" w:hAnsi="Times New Roman" w:cs="Times New Roman"/>
         </w:rPr>
-        <w:t>mashgiach ruchani of the Mir</w:t>
+        <w:t>m</w:t>
+      </w:r>
+      <w:r>
+        <w:rPr>
+          <w:rFonts w:ascii="Times New Roman" w:hAnsi="Times New Roman" w:cs="Times New Roman"/>
+        </w:rPr>
+        <w:t>ashgiach ruchani of the Mir</w:t>
+      </w:r>
+      <w:r>
+        <w:rPr>
+          <w:rFonts w:ascii="Times New Roman" w:hAnsi="Times New Roman" w:cs="Times New Roman"/>
+        </w:rPr>
+        <w:t>:</w:t>
+      </w:r>
+      <w:r>
+        <w:rPr>
+          <w:rFonts w:ascii="Times New Roman" w:hAnsi="Times New Roman" w:cs="Times New Roman"/>
+        </w:rPr>
+        <w:t xml:space="preserve"> </w:t>
+      </w:r>
+      <w:r>
+        <w:rPr>
+          <w:rFonts w:ascii="Times New Roman" w:hAnsi="Times New Roman" w:cs="Times New Roman" w:hint="cs"/>
+          <w:rtl/>
+        </w:rPr>
+        <w:t>אָמַר</w:t>
+      </w:r>
+      <w:r>
+        <w:rPr>
+          <w:rFonts w:ascii="Times New Roman" w:hAnsi="Times New Roman" w:cs="Times New Roman"/>
+          <w:rtl/>
+        </w:rPr>
+        <w:t xml:space="preserve"> </w:t>
+      </w:r>
+      <w:r>
+        <w:rPr>
+          <w:rFonts w:ascii="Times New Roman" w:hAnsi="Times New Roman" w:cs="Times New Roman" w:hint="cs"/>
+          <w:rtl/>
+        </w:rPr>
+        <w:t>רַבִּי</w:t>
+      </w:r>
+      <w:r>
+        <w:rPr>
+          <w:rFonts w:ascii="Times New Roman" w:hAnsi="Times New Roman" w:cs="Times New Roman"/>
+          <w:rtl/>
+        </w:rPr>
+        <w:t xml:space="preserve"> </w:t>
+      </w:r>
+      <w:r>
+        <w:rPr>
+          <w:rFonts w:ascii="Times New Roman" w:hAnsi="Times New Roman" w:cs="Times New Roman" w:hint="cs"/>
+          <w:rtl/>
+        </w:rPr>
+        <w:t>אֲבָהוּ</w:t>
+      </w:r>
+      <w:r>
+        <w:rPr>
+          <w:rFonts w:ascii="Times New Roman" w:hAnsi="Times New Roman" w:cs="Times New Roman"/>
+          <w:rtl/>
+        </w:rPr>
+        <w:t xml:space="preserve">: </w:t>
+      </w:r>
+      <w:r>
+        <w:rPr>
+          <w:rFonts w:ascii="Times New Roman" w:hAnsi="Times New Roman" w:cs="Times New Roman" w:hint="cs"/>
+          <w:rtl/>
+        </w:rPr>
+        <w:t>אָמְרוּ</w:t>
+      </w:r>
+      <w:r>
+        <w:rPr>
+          <w:rFonts w:ascii="Times New Roman" w:hAnsi="Times New Roman" w:cs="Times New Roman"/>
+          <w:rtl/>
+        </w:rPr>
+        <w:t xml:space="preserve"> </w:t>
+      </w:r>
+      <w:r>
+        <w:rPr>
+          <w:rFonts w:ascii="Times New Roman" w:hAnsi="Times New Roman" w:cs="Times New Roman" w:hint="cs"/>
+          <w:rtl/>
+        </w:rPr>
+        <w:t>מַלְאֲכֵי</w:t>
+      </w:r>
+      <w:r>
+        <w:rPr>
+          <w:rFonts w:ascii="Times New Roman" w:hAnsi="Times New Roman" w:cs="Times New Roman"/>
+          <w:rtl/>
+        </w:rPr>
+        <w:t xml:space="preserve"> </w:t>
+      </w:r>
+      <w:r>
+        <w:rPr>
+          <w:rFonts w:ascii="Times New Roman" w:hAnsi="Times New Roman" w:cs="Times New Roman" w:hint="cs"/>
+          <w:rtl/>
+        </w:rPr>
+        <w:t>הַשָּׁרֵת</w:t>
+      </w:r>
+      <w:r>
+        <w:rPr>
+          <w:rFonts w:ascii="Times New Roman" w:hAnsi="Times New Roman" w:cs="Times New Roman"/>
+          <w:rtl/>
+        </w:rPr>
+        <w:t xml:space="preserve"> </w:t>
+      </w:r>
+      <w:r>
+        <w:rPr>
+          <w:rFonts w:ascii="Times New Roman" w:hAnsi="Times New Roman" w:cs="Times New Roman" w:hint="cs"/>
+          <w:rtl/>
+        </w:rPr>
+        <w:t>לִפְנֵי</w:t>
+      </w:r>
+      <w:r>
+        <w:rPr>
+          <w:rFonts w:ascii="Times New Roman" w:hAnsi="Times New Roman" w:cs="Times New Roman"/>
+          <w:rtl/>
+        </w:rPr>
+        <w:t xml:space="preserve"> </w:t>
+      </w:r>
+      <w:r>
+        <w:rPr>
+          <w:rFonts w:ascii="Times New Roman" w:hAnsi="Times New Roman" w:cs="Times New Roman" w:hint="cs"/>
+          <w:rtl/>
+        </w:rPr>
+        <w:t>הַקָּדוֹשׁ</w:t>
+      </w:r>
+      <w:r>
+        <w:rPr>
+          <w:rFonts w:ascii="Times New Roman" w:hAnsi="Times New Roman" w:cs="Times New Roman"/>
+          <w:rtl/>
+        </w:rPr>
+        <w:t xml:space="preserve"> </w:t>
+      </w:r>
+      <w:r>
+        <w:rPr>
+          <w:rFonts w:ascii="Times New Roman" w:hAnsi="Times New Roman" w:cs="Times New Roman" w:hint="cs"/>
+          <w:rtl/>
+        </w:rPr>
+        <w:t>בָּרוּךְ</w:t>
+      </w:r>
+      <w:r>
+        <w:rPr>
+          <w:rFonts w:ascii="Times New Roman" w:hAnsi="Times New Roman" w:cs="Times New Roman"/>
+          <w:rtl/>
+        </w:rPr>
+        <w:t xml:space="preserve"> </w:t>
+      </w:r>
+      <w:r>
+        <w:rPr>
+          <w:rFonts w:ascii="Times New Roman" w:hAnsi="Times New Roman" w:cs="Times New Roman" w:hint="cs"/>
+          <w:rtl/>
+        </w:rPr>
+        <w:t>הוּא</w:t>
+      </w:r>
+      <w:r>
+        <w:rPr>
+          <w:rFonts w:ascii="Times New Roman" w:hAnsi="Times New Roman" w:cs="Times New Roman"/>
+        </w:rPr>
+        <w:t xml:space="preserve"> -</w:t>
+      </w:r>
+      <w:r>
+        <w:rPr>
+          <w:rFonts w:ascii="Times New Roman" w:hAnsi="Times New Roman" w:cs="Times New Roman"/>
+        </w:rPr>
+        <w:t xml:space="preserve"> The </w:t>
+      </w:r>
+      <w:r>
+        <w:rPr>
+          <w:rFonts w:ascii="Times New Roman" w:hAnsi="Times New Roman" w:cs="Times New Roman" w:hint="cs"/>
+          <w:rtl/>
+        </w:rPr>
+        <w:t>מלאכים</w:t>
+      </w:r>
+      <w:r>
+        <w:rPr>
+          <w:rFonts w:ascii="Times New Roman" w:hAnsi="Times New Roman" w:cs="Times New Roman"/>
+        </w:rPr>
+        <w:t xml:space="preserve"> said to </w:t>
+      </w:r>
+      <w:r>
+        <w:rPr>
+          <w:rFonts w:ascii="Times New Roman" w:hAnsi="Times New Roman" w:cs="Times New Roman"/>
+        </w:rPr>
+        <w:t xml:space="preserve">Hashem: </w:t>
+      </w:r>
+      <w:r>
+        <w:rPr>
+          <w:rFonts w:ascii="Times New Roman" w:hAnsi="Times New Roman" w:cs="Times New Roman" w:hint="cs"/>
+          <w:rtl/>
+        </w:rPr>
+        <w:t>רִבּוֹנוֹ</w:t>
+      </w:r>
+      <w:r>
+        <w:rPr>
+          <w:rFonts w:ascii="Times New Roman" w:hAnsi="Times New Roman" w:cs="Times New Roman"/>
+          <w:rtl/>
+        </w:rPr>
+        <w:t xml:space="preserve"> </w:t>
+      </w:r>
+      <w:r>
+        <w:rPr>
+          <w:rFonts w:ascii="Times New Roman" w:hAnsi="Times New Roman" w:cs="Times New Roman" w:hint="cs"/>
+          <w:rtl/>
+        </w:rPr>
+        <w:t>שֶׁל</w:t>
+      </w:r>
+      <w:r>
+        <w:rPr>
+          <w:rFonts w:ascii="Times New Roman" w:hAnsi="Times New Roman" w:cs="Times New Roman"/>
+          <w:rtl/>
+        </w:rPr>
+        <w:t xml:space="preserve"> </w:t>
+      </w:r>
+      <w:r>
+        <w:rPr>
+          <w:rFonts w:ascii="Times New Roman" w:hAnsi="Times New Roman" w:cs="Times New Roman" w:hint="cs"/>
+          <w:rtl/>
+        </w:rPr>
+        <w:t>עוֹלָם</w:t>
+      </w:r>
+      <w:r>
+        <w:rPr>
+          <w:rFonts w:ascii="Times New Roman" w:hAnsi="Times New Roman" w:cs="Times New Roman"/>
+          <w:rtl/>
+        </w:rPr>
+        <w:t xml:space="preserve">! </w:t>
+      </w:r>
+      <w:r>
+        <w:rPr>
+          <w:rFonts w:ascii="Times New Roman" w:hAnsi="Times New Roman" w:cs="Times New Roman" w:hint="cs"/>
+          <w:rtl/>
+        </w:rPr>
+        <w:t>מִפְּנֵי</w:t>
+      </w:r>
+      <w:r>
+        <w:rPr>
+          <w:rFonts w:ascii="Times New Roman" w:hAnsi="Times New Roman" w:cs="Times New Roman"/>
+          <w:rtl/>
+        </w:rPr>
+        <w:t xml:space="preserve"> </w:t>
+      </w:r>
+      <w:r>
+        <w:rPr>
+          <w:rFonts w:ascii="Times New Roman" w:hAnsi="Times New Roman" w:cs="Times New Roman" w:hint="cs"/>
+          <w:rtl/>
+        </w:rPr>
+        <w:t>מָה</w:t>
+      </w:r>
+      <w:r>
+        <w:rPr>
+          <w:rFonts w:ascii="Times New Roman" w:hAnsi="Times New Roman" w:cs="Times New Roman"/>
+          <w:rtl/>
+        </w:rPr>
+        <w:t xml:space="preserve"> </w:t>
+      </w:r>
+      <w:r>
+        <w:rPr>
+          <w:rFonts w:ascii="Times New Roman" w:hAnsi="Times New Roman" w:cs="Times New Roman" w:hint="cs"/>
+          <w:rtl/>
+        </w:rPr>
+        <w:t>אֵין</w:t>
+      </w:r>
+      <w:r>
+        <w:rPr>
+          <w:rFonts w:ascii="Times New Roman" w:hAnsi="Times New Roman" w:cs="Times New Roman"/>
+          <w:rtl/>
+        </w:rPr>
+        <w:t xml:space="preserve"> </w:t>
+      </w:r>
+      <w:r>
+        <w:rPr>
+          <w:rFonts w:ascii="Times New Roman" w:hAnsi="Times New Roman" w:cs="Times New Roman" w:hint="cs"/>
+          <w:rtl/>
+        </w:rPr>
+        <w:t>יִשְׂרָאֵל</w:t>
+      </w:r>
+      <w:r>
+        <w:rPr>
+          <w:rFonts w:ascii="Times New Roman" w:hAnsi="Times New Roman" w:cs="Times New Roman"/>
+          <w:rtl/>
+        </w:rPr>
+        <w:t xml:space="preserve"> </w:t>
+      </w:r>
+      <w:r>
+        <w:rPr>
+          <w:rFonts w:ascii="Times New Roman" w:hAnsi="Times New Roman" w:cs="Times New Roman" w:hint="cs"/>
+          <w:rtl/>
+        </w:rPr>
+        <w:t>אוֹמְרִים</w:t>
+      </w:r>
+      <w:r>
+        <w:rPr>
+          <w:rFonts w:ascii="Times New Roman" w:hAnsi="Times New Roman" w:cs="Times New Roman"/>
+          <w:rtl/>
+        </w:rPr>
+        <w:t xml:space="preserve"> </w:t>
+      </w:r>
+      <w:r>
+        <w:rPr>
+          <w:rFonts w:ascii="Times New Roman" w:hAnsi="Times New Roman" w:cs="Times New Roman" w:hint="cs"/>
+          <w:rtl/>
+        </w:rPr>
+        <w:t>שִׁירָה</w:t>
+      </w:r>
+      <w:r>
+        <w:rPr>
+          <w:rFonts w:ascii="Times New Roman" w:hAnsi="Times New Roman" w:cs="Times New Roman"/>
+          <w:rtl/>
+        </w:rPr>
+        <w:t xml:space="preserve"> </w:t>
+      </w:r>
+      <w:r>
+        <w:rPr>
+          <w:rFonts w:ascii="Times New Roman" w:hAnsi="Times New Roman" w:cs="Times New Roman" w:hint="cs"/>
+          <w:rtl/>
+        </w:rPr>
+        <w:t>לְפָנֶיךָ</w:t>
+      </w:r>
+      <w:r>
+        <w:rPr>
+          <w:rFonts w:ascii="Times New Roman" w:hAnsi="Times New Roman" w:cs="Times New Roman"/>
+          <w:rtl/>
+        </w:rPr>
+        <w:t xml:space="preserve"> </w:t>
+      </w:r>
+      <w:r>
+        <w:rPr>
+          <w:rFonts w:ascii="Times New Roman" w:hAnsi="Times New Roman" w:cs="Times New Roman" w:hint="cs"/>
+          <w:rtl/>
+        </w:rPr>
+        <w:t>בְּרֹאשׁ</w:t>
+      </w:r>
+      <w:r>
+        <w:rPr>
+          <w:rFonts w:ascii="Times New Roman" w:hAnsi="Times New Roman" w:cs="Times New Roman"/>
+          <w:rtl/>
+        </w:rPr>
+        <w:t xml:space="preserve"> </w:t>
+      </w:r>
+      <w:r>
+        <w:rPr>
+          <w:rFonts w:ascii="Times New Roman" w:hAnsi="Times New Roman" w:cs="Times New Roman" w:hint="cs"/>
+          <w:rtl/>
+        </w:rPr>
+        <w:t>הַשָּׁנָה</w:t>
+      </w:r>
+      <w:r>
+        <w:rPr>
+          <w:rFonts w:ascii="Times New Roman" w:hAnsi="Times New Roman" w:cs="Times New Roman"/>
+          <w:rtl/>
+        </w:rPr>
+        <w:t xml:space="preserve"> </w:t>
+      </w:r>
+      <w:r>
+        <w:rPr>
+          <w:rFonts w:ascii="Times New Roman" w:hAnsi="Times New Roman" w:cs="Times New Roman" w:hint="cs"/>
+          <w:rtl/>
+        </w:rPr>
+        <w:t>וּבְיוֹם</w:t>
+      </w:r>
+      <w:r>
+        <w:rPr>
+          <w:rFonts w:ascii="Times New Roman" w:hAnsi="Times New Roman" w:cs="Times New Roman"/>
+          <w:rtl/>
+        </w:rPr>
+        <w:t xml:space="preserve"> </w:t>
+      </w:r>
+      <w:r>
+        <w:rPr>
+          <w:rFonts w:ascii="Times New Roman" w:hAnsi="Times New Roman" w:cs="Times New Roman" w:hint="cs"/>
+          <w:rtl/>
+        </w:rPr>
+        <w:t>הַכִּפּוּרִים</w:t>
+      </w:r>
+      <w:r>
+        <w:rPr>
+          <w:rFonts w:ascii="Times New Roman" w:hAnsi="Times New Roman" w:cs="Times New Roman"/>
+        </w:rPr>
+        <w:t xml:space="preserve">? </w:t>
+      </w:r>
+      <w:r>
+        <w:rPr>
+          <w:rFonts w:ascii="Times New Roman" w:hAnsi="Times New Roman" w:cs="Times New Roman"/>
+        </w:rPr>
+        <w:t>Interesting question. We wouldn</w:t>
+      </w:r>
+      <w:r>
+        <w:rPr>
+          <w:rFonts w:ascii="Times New Roman" w:hAnsi="Times New Roman" w:cs="Times New Roman"/>
+        </w:rPr>
+        <w:t>’</w:t>
+      </w:r>
+      <w:r>
+        <w:rPr>
+          <w:rFonts w:ascii="Times New Roman" w:hAnsi="Times New Roman" w:cs="Times New Roman"/>
+        </w:rPr>
+        <w:t xml:space="preserve">t have thought of that, but the </w:t>
+      </w:r>
+      <w:r>
+        <w:rPr>
+          <w:rFonts w:ascii="Times New Roman" w:hAnsi="Times New Roman" w:cs="Times New Roman" w:hint="cs"/>
+          <w:rtl/>
+        </w:rPr>
+        <w:t>מלאכים</w:t>
+      </w:r>
+      <w:r>
+        <w:rPr>
+          <w:rFonts w:ascii="Times New Roman" w:hAnsi="Times New Roman" w:cs="Times New Roman"/>
+        </w:rPr>
+        <w:t xml:space="preserve"> did</w:t>
       </w:r>
       <w:r>
         <w:rPr>
@@ -1227,368 +1706,395 @@
       </w:r>
       <w:r>
         <w:rPr>
-          <w:rFonts w:ascii="Times New Roman" w:hAnsi="Times New Roman" w:cs="Times New Roman" w:hint="cs"/>
-          <w:rtl/>
-        </w:rPr>
-        <w:t>אָמַר</w:t>
-      </w:r>
-      <w:r>
-        <w:rPr>
-          <w:rFonts w:ascii="Times New Roman" w:hAnsi="Times New Roman" w:cs="Times New Roman"/>
-          <w:rtl/>
-        </w:rPr>
-        <w:t xml:space="preserve"> </w:t>
-      </w:r>
-      <w:r>
-        <w:rPr>
-          <w:rFonts w:ascii="Times New Roman" w:hAnsi="Times New Roman" w:cs="Times New Roman" w:hint="cs"/>
-          <w:rtl/>
-        </w:rPr>
-        <w:t>רַבִּי</w:t>
-      </w:r>
-      <w:r>
-        <w:rPr>
-          <w:rFonts w:ascii="Times New Roman" w:hAnsi="Times New Roman" w:cs="Times New Roman"/>
-          <w:rtl/>
-        </w:rPr>
-        <w:t xml:space="preserve"> </w:t>
-      </w:r>
-      <w:r>
-        <w:rPr>
-          <w:rFonts w:ascii="Times New Roman" w:hAnsi="Times New Roman" w:cs="Times New Roman" w:hint="cs"/>
-          <w:rtl/>
-        </w:rPr>
-        <w:t>אֲבָהוּ</w:t>
-      </w:r>
-      <w:r>
-        <w:rPr>
-          <w:rFonts w:ascii="Times New Roman" w:hAnsi="Times New Roman" w:cs="Times New Roman"/>
-          <w:rtl/>
+          <w:rFonts w:ascii="Times New Roman" w:hAnsi="Times New Roman" w:cs="Times New Roman"/>
+        </w:rPr>
+        <w:t>T</w:t>
+      </w:r>
+      <w:r>
+        <w:rPr>
+          <w:rFonts w:ascii="Times New Roman" w:hAnsi="Times New Roman" w:cs="Times New Roman"/>
+        </w:rPr>
+        <w:t xml:space="preserve">hese are days of </w:t>
+      </w:r>
+      <w:r>
+        <w:rPr>
+          <w:rFonts w:ascii="Times New Roman" w:hAnsi="Times New Roman" w:cs="Times New Roman" w:hint="cs"/>
+          <w:rtl/>
+        </w:rPr>
+        <w:t>קדושה</w:t>
+      </w:r>
+      <w:r>
+        <w:rPr>
+          <w:rFonts w:ascii="Times New Roman" w:hAnsi="Times New Roman" w:cs="Times New Roman"/>
+        </w:rPr>
+        <w:t xml:space="preserve"> and on days of </w:t>
+      </w:r>
+      <w:r>
+        <w:rPr>
+          <w:rFonts w:ascii="Times New Roman" w:hAnsi="Times New Roman" w:cs="Times New Roman" w:hint="cs"/>
+          <w:rtl/>
+        </w:rPr>
+        <w:t>קדושה</w:t>
+      </w:r>
+      <w:r>
+        <w:rPr>
+          <w:rFonts w:ascii="Times New Roman" w:hAnsi="Times New Roman" w:cs="Times New Roman"/>
+        </w:rPr>
+        <w:t>, it</w:t>
+      </w:r>
+      <w:r>
+        <w:rPr>
+          <w:rFonts w:ascii="Times New Roman" w:hAnsi="Times New Roman" w:cs="Times New Roman"/>
+        </w:rPr>
+        <w:t>’</w:t>
+      </w:r>
+      <w:r>
+        <w:rPr>
+          <w:rFonts w:ascii="Times New Roman" w:hAnsi="Times New Roman" w:cs="Times New Roman"/>
+        </w:rPr>
+        <w:t xml:space="preserve">s our job to say </w:t>
+      </w:r>
+      <w:r>
+        <w:rPr>
+          <w:rFonts w:ascii="Times New Roman" w:hAnsi="Times New Roman" w:cs="Times New Roman" w:hint="cs"/>
+          <w:rtl/>
+        </w:rPr>
+        <w:t>שירה</w:t>
+      </w:r>
+      <w:r>
+        <w:rPr>
+          <w:rFonts w:ascii="Times New Roman" w:hAnsi="Times New Roman" w:cs="Times New Roman"/>
+        </w:rPr>
+        <w:t xml:space="preserve"> before </w:t>
+      </w:r>
+      <w:r>
+        <w:rPr>
+          <w:rFonts w:ascii="Times New Roman" w:hAnsi="Times New Roman" w:cs="Times New Roman"/>
+        </w:rPr>
+        <w:t>Hashem</w:t>
+      </w:r>
+      <w:r>
+        <w:rPr>
+          <w:rFonts w:ascii="Times New Roman" w:hAnsi="Times New Roman" w:cs="Times New Roman"/>
+        </w:rPr>
+        <w:t xml:space="preserve">. </w:t>
+      </w:r>
+      <w:r>
+        <w:rPr>
+          <w:rFonts w:ascii="Times New Roman" w:hAnsi="Times New Roman" w:cs="Times New Roman"/>
+        </w:rPr>
+        <w:t>Hashem</w:t>
+      </w:r>
+      <w:r>
+        <w:rPr>
+          <w:rFonts w:ascii="Times New Roman" w:hAnsi="Times New Roman" w:cs="Times New Roman"/>
+        </w:rPr>
+        <w:t xml:space="preserve"> answered them and said the answer which we all know</w:t>
+      </w:r>
+      <w:r>
+        <w:rPr>
+          <w:rFonts w:ascii="Times New Roman" w:hAnsi="Times New Roman" w:cs="Times New Roman"/>
+        </w:rPr>
+        <w:t>:</w:t>
+      </w:r>
+      <w:r>
+        <w:rPr>
+          <w:rFonts w:ascii="Times New Roman" w:hAnsi="Times New Roman" w:cs="Times New Roman" w:hint="cs"/>
+          <w:rtl/>
+        </w:rPr>
+        <w:t>אֶפְשָׁר</w:t>
+      </w:r>
+      <w:r>
+        <w:rPr>
+          <w:rFonts w:ascii="Times New Roman" w:hAnsi="Times New Roman" w:cs="Times New Roman"/>
+          <w:rtl/>
+        </w:rPr>
+        <w:t xml:space="preserve"> </w:t>
+      </w:r>
+      <w:r>
+        <w:rPr>
+          <w:rFonts w:ascii="Times New Roman" w:hAnsi="Times New Roman" w:cs="Times New Roman" w:hint="cs"/>
+          <w:rtl/>
+        </w:rPr>
+        <w:t>מֶלֶךְ</w:t>
+      </w:r>
+      <w:r>
+        <w:rPr>
+          <w:rFonts w:ascii="Times New Roman" w:hAnsi="Times New Roman" w:cs="Times New Roman"/>
+          <w:rtl/>
+        </w:rPr>
+        <w:t xml:space="preserve"> </w:t>
+      </w:r>
+      <w:r>
+        <w:rPr>
+          <w:rFonts w:ascii="Times New Roman" w:hAnsi="Times New Roman" w:cs="Times New Roman" w:hint="cs"/>
+          <w:rtl/>
+        </w:rPr>
+        <w:t>יוֹשֵׁב</w:t>
+      </w:r>
+      <w:r>
+        <w:rPr>
+          <w:rFonts w:ascii="Times New Roman" w:hAnsi="Times New Roman" w:cs="Times New Roman"/>
+          <w:rtl/>
+        </w:rPr>
+        <w:t xml:space="preserve"> </w:t>
+      </w:r>
+      <w:r>
+        <w:rPr>
+          <w:rFonts w:ascii="Times New Roman" w:hAnsi="Times New Roman" w:cs="Times New Roman" w:hint="cs"/>
+          <w:rtl/>
+        </w:rPr>
+        <w:t>עַל</w:t>
+      </w:r>
+      <w:r>
+        <w:rPr>
+          <w:rFonts w:ascii="Times New Roman" w:hAnsi="Times New Roman" w:cs="Times New Roman"/>
+          <w:rtl/>
+        </w:rPr>
+        <w:t xml:space="preserve"> </w:t>
+      </w:r>
+      <w:r>
+        <w:rPr>
+          <w:rFonts w:ascii="Times New Roman" w:hAnsi="Times New Roman" w:cs="Times New Roman" w:hint="cs"/>
+          <w:rtl/>
+        </w:rPr>
+        <w:t>כִּסֵּא</w:t>
+      </w:r>
+      <w:r>
+        <w:rPr>
+          <w:rFonts w:ascii="Times New Roman" w:hAnsi="Times New Roman" w:cs="Times New Roman"/>
+          <w:rtl/>
+        </w:rPr>
+        <w:t xml:space="preserve"> </w:t>
+      </w:r>
+      <w:r>
+        <w:rPr>
+          <w:rFonts w:ascii="Times New Roman" w:hAnsi="Times New Roman" w:cs="Times New Roman" w:hint="cs"/>
+          <w:rtl/>
+        </w:rPr>
+        <w:t>דִין</w:t>
+      </w:r>
+      <w:r>
+        <w:rPr>
+          <w:rFonts w:ascii="Times New Roman" w:hAnsi="Times New Roman" w:cs="Times New Roman"/>
+          <w:rtl/>
+        </w:rPr>
+        <w:t xml:space="preserve">, </w:t>
+      </w:r>
+      <w:r>
+        <w:rPr>
+          <w:rFonts w:ascii="Times New Roman" w:hAnsi="Times New Roman" w:cs="Times New Roman" w:hint="cs"/>
+          <w:rtl/>
+        </w:rPr>
+        <w:t>וְסִפְרֵי</w:t>
+      </w:r>
+      <w:r>
+        <w:rPr>
+          <w:rFonts w:ascii="Times New Roman" w:hAnsi="Times New Roman" w:cs="Times New Roman"/>
+          <w:rtl/>
+        </w:rPr>
+        <w:t xml:space="preserve"> </w:t>
+      </w:r>
+      <w:r>
+        <w:rPr>
+          <w:rFonts w:ascii="Times New Roman" w:hAnsi="Times New Roman" w:cs="Times New Roman" w:hint="cs"/>
+          <w:rtl/>
+        </w:rPr>
+        <w:t>חַיִּים</w:t>
+      </w:r>
+      <w:r>
+        <w:rPr>
+          <w:rFonts w:ascii="Times New Roman" w:hAnsi="Times New Roman" w:cs="Times New Roman"/>
+          <w:rtl/>
+        </w:rPr>
+        <w:t xml:space="preserve"> </w:t>
+      </w:r>
+      <w:r>
+        <w:rPr>
+          <w:rFonts w:ascii="Times New Roman" w:hAnsi="Times New Roman" w:cs="Times New Roman" w:hint="cs"/>
+          <w:rtl/>
+        </w:rPr>
+        <w:t>וְסִפְרֵי</w:t>
+      </w:r>
+      <w:r>
+        <w:rPr>
+          <w:rFonts w:ascii="Times New Roman" w:hAnsi="Times New Roman" w:cs="Times New Roman"/>
+          <w:rtl/>
+        </w:rPr>
+        <w:t xml:space="preserve"> </w:t>
+      </w:r>
+      <w:r>
+        <w:rPr>
+          <w:rFonts w:ascii="Times New Roman" w:hAnsi="Times New Roman" w:cs="Times New Roman" w:hint="cs"/>
+          <w:rtl/>
+        </w:rPr>
+        <w:t>מֵתִים</w:t>
+      </w:r>
+      <w:r>
+        <w:rPr>
+          <w:rFonts w:ascii="Times New Roman" w:hAnsi="Times New Roman" w:cs="Times New Roman"/>
+          <w:rtl/>
+        </w:rPr>
+        <w:t xml:space="preserve"> </w:t>
+      </w:r>
+      <w:r>
+        <w:rPr>
+          <w:rFonts w:ascii="Times New Roman" w:hAnsi="Times New Roman" w:cs="Times New Roman" w:hint="cs"/>
+          <w:rtl/>
+        </w:rPr>
+        <w:t>פְּתוּחִין</w:t>
+      </w:r>
+      <w:r>
+        <w:rPr>
+          <w:rFonts w:ascii="Times New Roman" w:hAnsi="Times New Roman" w:cs="Times New Roman"/>
+          <w:rtl/>
+        </w:rPr>
+        <w:t xml:space="preserve"> </w:t>
+      </w:r>
+      <w:r>
+        <w:rPr>
+          <w:rFonts w:ascii="Times New Roman" w:hAnsi="Times New Roman" w:cs="Times New Roman" w:hint="cs"/>
+          <w:rtl/>
+        </w:rPr>
+        <w:t>לְפָנָיו</w:t>
+      </w:r>
+      <w:r>
+        <w:rPr>
+          <w:rFonts w:ascii="Times New Roman" w:hAnsi="Times New Roman" w:cs="Times New Roman"/>
+        </w:rPr>
+        <w:t xml:space="preserve"> </w:t>
+      </w:r>
+      <w:r>
+        <w:rPr>
+          <w:rFonts w:ascii="Times New Roman" w:hAnsi="Times New Roman" w:cs="Times New Roman"/>
+        </w:rPr>
+        <w:t xml:space="preserve">- </w:t>
+      </w:r>
+      <w:r>
+        <w:rPr>
+          <w:rFonts w:ascii="Times New Roman" w:hAnsi="Times New Roman" w:cs="Times New Roman"/>
+        </w:rPr>
+        <w:t>The book of life and the book of death is open in front of the king who</w:t>
+      </w:r>
+      <w:r>
+        <w:rPr>
+          <w:rFonts w:ascii="Times New Roman" w:hAnsi="Times New Roman" w:cs="Times New Roman"/>
+        </w:rPr>
+        <w:t>’</w:t>
+      </w:r>
+      <w:r>
+        <w:rPr>
+          <w:rFonts w:ascii="Times New Roman" w:hAnsi="Times New Roman" w:cs="Times New Roman"/>
+        </w:rPr>
+        <w:t>s about to make a judgment</w:t>
+      </w:r>
+      <w:r>
+        <w:rPr>
+          <w:rFonts w:ascii="Times New Roman" w:hAnsi="Times New Roman" w:cs="Times New Roman"/>
+        </w:rPr>
+        <w:t xml:space="preserve">; </w:t>
+      </w:r>
+      <w:r>
+        <w:rPr>
+          <w:rFonts w:ascii="Times New Roman" w:hAnsi="Times New Roman" w:cs="Times New Roman" w:hint="cs"/>
+          <w:rtl/>
+        </w:rPr>
+        <w:t>וְיִשְׂרָאֵל</w:t>
+      </w:r>
+      <w:r>
+        <w:rPr>
+          <w:rFonts w:ascii="Times New Roman" w:hAnsi="Times New Roman" w:cs="Times New Roman"/>
+          <w:rtl/>
+        </w:rPr>
+        <w:t xml:space="preserve"> </w:t>
+      </w:r>
+      <w:r>
+        <w:rPr>
+          <w:rFonts w:ascii="Times New Roman" w:hAnsi="Times New Roman" w:cs="Times New Roman" w:hint="cs"/>
+          <w:rtl/>
+        </w:rPr>
+        <w:t>אוֹמְרִים</w:t>
+      </w:r>
+      <w:r>
+        <w:rPr>
+          <w:rFonts w:ascii="Times New Roman" w:hAnsi="Times New Roman" w:cs="Times New Roman"/>
+          <w:rtl/>
+        </w:rPr>
+        <w:t xml:space="preserve"> </w:t>
+      </w:r>
+      <w:r>
+        <w:rPr>
+          <w:rFonts w:ascii="Times New Roman" w:hAnsi="Times New Roman" w:cs="Times New Roman" w:hint="cs"/>
+          <w:rtl/>
+        </w:rPr>
+        <w:t>שִׁירָה</w:t>
+      </w:r>
+      <w:r>
+        <w:rPr>
+          <w:rFonts w:ascii="Times New Roman" w:hAnsi="Times New Roman" w:cs="Times New Roman"/>
+        </w:rPr>
+        <w:t xml:space="preserve">? </w:t>
+      </w:r>
+      <w:r>
+        <w:rPr>
+          <w:rFonts w:ascii="Times New Roman" w:hAnsi="Times New Roman" w:cs="Times New Roman"/>
+        </w:rPr>
+        <w:t>I</w:t>
+      </w:r>
+      <w:r>
+        <w:rPr>
+          <w:rFonts w:ascii="Times New Roman" w:hAnsi="Times New Roman" w:cs="Times New Roman"/>
+        </w:rPr>
+        <w:t xml:space="preserve">n that </w:t>
+      </w:r>
+      <w:r>
+        <w:rPr>
+          <w:rFonts w:ascii="Times New Roman" w:hAnsi="Times New Roman" w:cs="Times New Roman"/>
+        </w:rPr>
+        <w:t>Gemara</w:t>
+      </w:r>
+      <w:r>
+        <w:rPr>
+          <w:rFonts w:ascii="Times New Roman" w:hAnsi="Times New Roman" w:cs="Times New Roman"/>
+        </w:rPr>
+        <w:t>, there</w:t>
+      </w:r>
+      <w:r>
+        <w:rPr>
+          <w:rFonts w:ascii="Times New Roman" w:hAnsi="Times New Roman" w:cs="Times New Roman"/>
+        </w:rPr>
+        <w:t>’</w:t>
+      </w:r>
+      <w:r>
+        <w:rPr>
+          <w:rFonts w:ascii="Times New Roman" w:hAnsi="Times New Roman" w:cs="Times New Roman"/>
+        </w:rPr>
+        <w:t xml:space="preserve">s a famous </w:t>
+      </w:r>
+      <w:r>
+        <w:rPr>
+          <w:rFonts w:ascii="Times New Roman" w:hAnsi="Times New Roman" w:cs="Times New Roman" w:hint="cs"/>
+          <w:rtl/>
+        </w:rPr>
+        <w:t>שאלה</w:t>
+      </w:r>
+      <w:r>
+        <w:rPr>
+          <w:rFonts w:ascii="Times New Roman" w:hAnsi="Times New Roman" w:cs="Times New Roman"/>
         </w:rPr>
         <w:t xml:space="preserve">: </w:t>
       </w:r>
       <w:r>
         <w:rPr>
-          <w:rFonts w:ascii="Times New Roman" w:hAnsi="Times New Roman" w:cs="Times New Roman" w:hint="cs"/>
-          <w:rtl/>
-        </w:rPr>
-        <w:t>אָמְרוּ</w:t>
-      </w:r>
-      <w:r>
-        <w:rPr>
-          <w:rFonts w:ascii="Times New Roman" w:hAnsi="Times New Roman" w:cs="Times New Roman"/>
-          <w:rtl/>
-        </w:rPr>
-        <w:t xml:space="preserve"> </w:t>
-      </w:r>
-      <w:r>
-        <w:rPr>
-          <w:rFonts w:ascii="Times New Roman" w:hAnsi="Times New Roman" w:cs="Times New Roman" w:hint="cs"/>
-          <w:rtl/>
-        </w:rPr>
-        <w:t>מַלְאֲכֵי</w:t>
-      </w:r>
-      <w:r>
-        <w:rPr>
-          <w:rFonts w:ascii="Times New Roman" w:hAnsi="Times New Roman" w:cs="Times New Roman"/>
-          <w:rtl/>
-        </w:rPr>
-        <w:t xml:space="preserve"> </w:t>
-      </w:r>
-      <w:r>
-        <w:rPr>
-          <w:rFonts w:ascii="Times New Roman" w:hAnsi="Times New Roman" w:cs="Times New Roman" w:hint="cs"/>
-          <w:rtl/>
-        </w:rPr>
-        <w:t>הַשָּׁרֵת</w:t>
-      </w:r>
-      <w:r>
-        <w:rPr>
-          <w:rFonts w:ascii="Times New Roman" w:hAnsi="Times New Roman" w:cs="Times New Roman"/>
-          <w:rtl/>
-        </w:rPr>
-        <w:t xml:space="preserve"> </w:t>
-      </w:r>
-      <w:r>
-        <w:rPr>
-          <w:rFonts w:ascii="Times New Roman" w:hAnsi="Times New Roman" w:cs="Times New Roman" w:hint="cs"/>
-          <w:rtl/>
-        </w:rPr>
-        <w:t>לִפְנֵי</w:t>
-      </w:r>
-      <w:r>
-        <w:rPr>
-          <w:rFonts w:ascii="Times New Roman" w:hAnsi="Times New Roman" w:cs="Times New Roman"/>
-          <w:rtl/>
-        </w:rPr>
-        <w:t xml:space="preserve"> </w:t>
-      </w:r>
-      <w:r>
-        <w:rPr>
-          <w:rFonts w:ascii="Times New Roman" w:hAnsi="Times New Roman" w:cs="Times New Roman" w:hint="cs"/>
-          <w:rtl/>
-        </w:rPr>
-        <w:t>הַקָּדוֹשׁ</w:t>
-      </w:r>
-      <w:r>
-        <w:rPr>
-          <w:rFonts w:ascii="Times New Roman" w:hAnsi="Times New Roman" w:cs="Times New Roman"/>
-          <w:rtl/>
-        </w:rPr>
-        <w:t xml:space="preserve"> </w:t>
-      </w:r>
-      <w:r>
-        <w:rPr>
-          <w:rFonts w:ascii="Times New Roman" w:hAnsi="Times New Roman" w:cs="Times New Roman" w:hint="cs"/>
-          <w:rtl/>
-        </w:rPr>
-        <w:t>בָּרוּךְ</w:t>
-      </w:r>
-      <w:r>
-        <w:rPr>
-          <w:rFonts w:ascii="Times New Roman" w:hAnsi="Times New Roman" w:cs="Times New Roman"/>
-          <w:rtl/>
-        </w:rPr>
-        <w:t xml:space="preserve"> </w:t>
-      </w:r>
-      <w:r>
-        <w:rPr>
-          <w:rFonts w:ascii="Times New Roman" w:hAnsi="Times New Roman" w:cs="Times New Roman" w:hint="cs"/>
-          <w:rtl/>
-        </w:rPr>
-        <w:t>הוּא</w:t>
-      </w:r>
-      <w:r>
-        <w:rPr>
-          <w:rFonts w:ascii="Times New Roman" w:hAnsi="Times New Roman" w:cs="Times New Roman"/>
-        </w:rPr>
-        <w:t xml:space="preserve"> -</w:t>
-      </w:r>
-      <w:r>
-        <w:rPr>
-          <w:rFonts w:ascii="Times New Roman" w:hAnsi="Times New Roman" w:cs="Times New Roman"/>
-        </w:rPr>
-        <w:t xml:space="preserve"> The </w:t>
-      </w:r>
-      <w:r>
-        <w:rPr>
-          <w:rFonts w:ascii="Times New Roman" w:hAnsi="Times New Roman" w:cs="Times New Roman" w:hint="cs"/>
-          <w:rtl/>
-        </w:rPr>
-        <w:t>מלאכים</w:t>
-      </w:r>
-      <w:r>
-        <w:rPr>
-          <w:rFonts w:ascii="Times New Roman" w:hAnsi="Times New Roman" w:cs="Times New Roman"/>
-        </w:rPr>
-        <w:t xml:space="preserve"> said to </w:t>
-      </w:r>
-      <w:r>
-        <w:rPr>
-          <w:rFonts w:ascii="Times New Roman" w:hAnsi="Times New Roman" w:cs="Times New Roman"/>
-        </w:rPr>
-        <w:t xml:space="preserve">Hashem: </w:t>
-      </w:r>
-      <w:r>
-        <w:rPr>
-          <w:rFonts w:ascii="Times New Roman" w:hAnsi="Times New Roman" w:cs="Times New Roman" w:hint="cs"/>
-          <w:rtl/>
-        </w:rPr>
-        <w:t>רִבּוֹנוֹ</w:t>
-      </w:r>
-      <w:r>
-        <w:rPr>
-          <w:rFonts w:ascii="Times New Roman" w:hAnsi="Times New Roman" w:cs="Times New Roman"/>
-          <w:rtl/>
-        </w:rPr>
-        <w:t xml:space="preserve"> </w:t>
-      </w:r>
-      <w:r>
-        <w:rPr>
-          <w:rFonts w:ascii="Times New Roman" w:hAnsi="Times New Roman" w:cs="Times New Roman" w:hint="cs"/>
-          <w:rtl/>
-        </w:rPr>
-        <w:t>שֶׁל</w:t>
-      </w:r>
-      <w:r>
-        <w:rPr>
-          <w:rFonts w:ascii="Times New Roman" w:hAnsi="Times New Roman" w:cs="Times New Roman"/>
-          <w:rtl/>
-        </w:rPr>
-        <w:t xml:space="preserve"> </w:t>
-      </w:r>
-      <w:r>
-        <w:rPr>
-          <w:rFonts w:ascii="Times New Roman" w:hAnsi="Times New Roman" w:cs="Times New Roman" w:hint="cs"/>
-          <w:rtl/>
-        </w:rPr>
-        <w:t>עוֹלָם</w:t>
-      </w:r>
-      <w:r>
-        <w:rPr>
-          <w:rFonts w:ascii="Times New Roman" w:hAnsi="Times New Roman" w:cs="Times New Roman"/>
-          <w:rtl/>
-        </w:rPr>
-        <w:t xml:space="preserve">! </w:t>
-      </w:r>
-      <w:r>
-        <w:rPr>
-          <w:rFonts w:ascii="Times New Roman" w:hAnsi="Times New Roman" w:cs="Times New Roman" w:hint="cs"/>
-          <w:rtl/>
-        </w:rPr>
-        <w:t>מִפְּנֵי</w:t>
-      </w:r>
-      <w:r>
-        <w:rPr>
-          <w:rFonts w:ascii="Times New Roman" w:hAnsi="Times New Roman" w:cs="Times New Roman"/>
-          <w:rtl/>
-        </w:rPr>
-        <w:t xml:space="preserve"> </w:t>
-      </w:r>
-      <w:r>
-        <w:rPr>
-          <w:rFonts w:ascii="Times New Roman" w:hAnsi="Times New Roman" w:cs="Times New Roman" w:hint="cs"/>
-          <w:rtl/>
-        </w:rPr>
-        <w:t>מָה</w:t>
-      </w:r>
-      <w:r>
-        <w:rPr>
-          <w:rFonts w:ascii="Times New Roman" w:hAnsi="Times New Roman" w:cs="Times New Roman"/>
-          <w:rtl/>
-        </w:rPr>
-        <w:t xml:space="preserve"> </w:t>
-      </w:r>
-      <w:r>
-        <w:rPr>
-          <w:rFonts w:ascii="Times New Roman" w:hAnsi="Times New Roman" w:cs="Times New Roman" w:hint="cs"/>
-          <w:rtl/>
-        </w:rPr>
-        <w:t>אֵין</w:t>
-      </w:r>
-      <w:r>
-        <w:rPr>
-          <w:rFonts w:ascii="Times New Roman" w:hAnsi="Times New Roman" w:cs="Times New Roman"/>
-          <w:rtl/>
-        </w:rPr>
-        <w:t xml:space="preserve"> </w:t>
-      </w:r>
-      <w:r>
-        <w:rPr>
-          <w:rFonts w:ascii="Times New Roman" w:hAnsi="Times New Roman" w:cs="Times New Roman" w:hint="cs"/>
-          <w:rtl/>
-        </w:rPr>
-        <w:t>יִשְׂרָאֵל</w:t>
-      </w:r>
-      <w:r>
-        <w:rPr>
-          <w:rFonts w:ascii="Times New Roman" w:hAnsi="Times New Roman" w:cs="Times New Roman"/>
-          <w:rtl/>
-        </w:rPr>
-        <w:t xml:space="preserve"> </w:t>
-      </w:r>
-      <w:r>
-        <w:rPr>
-          <w:rFonts w:ascii="Times New Roman" w:hAnsi="Times New Roman" w:cs="Times New Roman" w:hint="cs"/>
-          <w:rtl/>
-        </w:rPr>
-        <w:t>אוֹמְרִים</w:t>
-      </w:r>
-      <w:r>
-        <w:rPr>
-          <w:rFonts w:ascii="Times New Roman" w:hAnsi="Times New Roman" w:cs="Times New Roman"/>
-          <w:rtl/>
-        </w:rPr>
-        <w:t xml:space="preserve"> </w:t>
-      </w:r>
-      <w:r>
-        <w:rPr>
-          <w:rFonts w:ascii="Times New Roman" w:hAnsi="Times New Roman" w:cs="Times New Roman" w:hint="cs"/>
-          <w:rtl/>
-        </w:rPr>
-        <w:t>שִׁירָה</w:t>
-      </w:r>
-      <w:r>
-        <w:rPr>
-          <w:rFonts w:ascii="Times New Roman" w:hAnsi="Times New Roman" w:cs="Times New Roman"/>
-          <w:rtl/>
-        </w:rPr>
-        <w:t xml:space="preserve"> </w:t>
-      </w:r>
-      <w:r>
-        <w:rPr>
-          <w:rFonts w:ascii="Times New Roman" w:hAnsi="Times New Roman" w:cs="Times New Roman" w:hint="cs"/>
-          <w:rtl/>
-        </w:rPr>
-        <w:t>לְפָנֶיךָ</w:t>
-      </w:r>
-      <w:r>
-        <w:rPr>
-          <w:rFonts w:ascii="Times New Roman" w:hAnsi="Times New Roman" w:cs="Times New Roman"/>
-          <w:rtl/>
-        </w:rPr>
-        <w:t xml:space="preserve"> </w:t>
-      </w:r>
-      <w:r>
-        <w:rPr>
-          <w:rFonts w:ascii="Times New Roman" w:hAnsi="Times New Roman" w:cs="Times New Roman" w:hint="cs"/>
-          <w:rtl/>
-        </w:rPr>
-        <w:t>בְּרֹאשׁ</w:t>
-      </w:r>
-      <w:r>
-        <w:rPr>
-          <w:rFonts w:ascii="Times New Roman" w:hAnsi="Times New Roman" w:cs="Times New Roman"/>
-          <w:rtl/>
-        </w:rPr>
-        <w:t xml:space="preserve"> </w:t>
-      </w:r>
-      <w:r>
-        <w:rPr>
-          <w:rFonts w:ascii="Times New Roman" w:hAnsi="Times New Roman" w:cs="Times New Roman" w:hint="cs"/>
-          <w:rtl/>
-        </w:rPr>
-        <w:t>הַשָּׁנָה</w:t>
-      </w:r>
-      <w:r>
-        <w:rPr>
-          <w:rFonts w:ascii="Times New Roman" w:hAnsi="Times New Roman" w:cs="Times New Roman"/>
-          <w:rtl/>
-        </w:rPr>
-        <w:t xml:space="preserve"> </w:t>
-      </w:r>
-      <w:r>
-        <w:rPr>
-          <w:rFonts w:ascii="Times New Roman" w:hAnsi="Times New Roman" w:cs="Times New Roman" w:hint="cs"/>
-          <w:rtl/>
-        </w:rPr>
-        <w:t>וּבְיוֹם</w:t>
-      </w:r>
-      <w:r>
-        <w:rPr>
-          <w:rFonts w:ascii="Times New Roman" w:hAnsi="Times New Roman" w:cs="Times New Roman"/>
-          <w:rtl/>
-        </w:rPr>
-        <w:t xml:space="preserve"> </w:t>
-      </w:r>
-      <w:r>
-        <w:rPr>
-          <w:rFonts w:ascii="Times New Roman" w:hAnsi="Times New Roman" w:cs="Times New Roman" w:hint="cs"/>
-          <w:rtl/>
-        </w:rPr>
-        <w:t>הַכִּפּוּרִים</w:t>
-      </w:r>
-      <w:r>
-        <w:rPr>
-          <w:rFonts w:ascii="Times New Roman" w:hAnsi="Times New Roman" w:cs="Times New Roman"/>
-        </w:rPr>
-        <w:t xml:space="preserve">? </w:t>
-      </w:r>
-      <w:r>
-        <w:rPr>
-          <w:rFonts w:ascii="Times New Roman" w:hAnsi="Times New Roman" w:cs="Times New Roman"/>
-        </w:rPr>
-        <w:t>Interesting question. We wouldn</w:t>
+          <w:rFonts w:ascii="Times New Roman" w:hAnsi="Times New Roman" w:cs="Times New Roman"/>
+        </w:rPr>
+        <w:t>We know and we count upon, we look forward to</w:t>
+      </w:r>
+      <w:r>
+        <w:rPr>
+          <w:rFonts w:ascii="Times New Roman" w:hAnsi="Times New Roman" w:cs="Times New Roman"/>
+        </w:rPr>
+        <w:t xml:space="preserve"> Hashem</w:t>
       </w:r>
       <w:r>
         <w:rPr>
@@ -1600,32 +2106,359 @@
         <w:rPr>
           <w:rFonts w:ascii="Times New Roman" w:hAnsi="Times New Roman" w:cs="Times New Roman"/>
         </w:rPr>
-        <w:t xml:space="preserve">t have thought of that, but the </w:t>
-      </w:r>
-      <w:r>
-        <w:rPr>
-          <w:rFonts w:ascii="Times New Roman" w:hAnsi="Times New Roman" w:cs="Times New Roman" w:hint="cs"/>
-          <w:rtl/>
-        </w:rPr>
-        <w:t>מלאכים</w:t>
-      </w:r>
-      <w:r>
-        <w:rPr>
-          <w:rFonts w:ascii="Times New Roman" w:hAnsi="Times New Roman" w:cs="Times New Roman"/>
-        </w:rPr>
-        <w:t xml:space="preserve"> did</w:t>
-      </w:r>
-      <w:r>
-        <w:rPr>
-          <w:rFonts w:ascii="Times New Roman" w:hAnsi="Times New Roman" w:cs="Times New Roman"/>
-        </w:rPr>
-        <w:t>.</w:t>
-      </w:r>
-      <w:r>
-        <w:rPr>
-          <w:rFonts w:ascii="Times New Roman" w:hAnsi="Times New Roman" w:cs="Times New Roman"/>
-        </w:rPr>
-        <w:t xml:space="preserve"> </w:t>
+        <w:t>s</w:t>
+      </w:r>
+      <w:r>
+        <w:rPr>
+          <w:rFonts w:ascii="Times New Roman" w:hAnsi="Times New Roman" w:cs="Times New Roman"/>
+        </w:rPr>
+        <w:t xml:space="preserve"> </w:t>
+      </w:r>
+      <w:r>
+        <w:rPr>
+          <w:rFonts w:ascii="Times New Roman" w:hAnsi="Times New Roman" w:cs="Times New Roman" w:hint="cs"/>
+          <w:rtl/>
+        </w:rPr>
+        <w:t>חסד</w:t>
+      </w:r>
+      <w:r>
+        <w:rPr>
+          <w:rFonts w:ascii="Times New Roman" w:hAnsi="Times New Roman" w:cs="Times New Roman"/>
+        </w:rPr>
+        <w:t xml:space="preserve">. We have tremendous </w:t>
+      </w:r>
+      <w:r>
+        <w:rPr>
+          <w:rFonts w:ascii="Times New Roman" w:hAnsi="Times New Roman" w:cs="Times New Roman" w:hint="cs"/>
+          <w:rtl/>
+        </w:rPr>
+        <w:t>אמונה</w:t>
+      </w:r>
+      <w:r>
+        <w:rPr>
+          <w:rFonts w:ascii="Times New Roman" w:hAnsi="Times New Roman" w:cs="Times New Roman"/>
+        </w:rPr>
+        <w:t>, not because we deserve it, but because we</w:t>
+      </w:r>
+      <w:r>
+        <w:rPr>
+          <w:rFonts w:ascii="Times New Roman" w:hAnsi="Times New Roman" w:cs="Times New Roman"/>
+        </w:rPr>
+        <w:t>’</w:t>
+      </w:r>
+      <w:r>
+        <w:rPr>
+          <w:rFonts w:ascii="Times New Roman" w:hAnsi="Times New Roman" w:cs="Times New Roman"/>
+        </w:rPr>
+        <w:t xml:space="preserve">re </w:t>
+      </w:r>
+      <w:r>
+        <w:rPr>
+          <w:rFonts w:ascii="Times New Roman" w:hAnsi="Times New Roman" w:cs="Times New Roman"/>
+        </w:rPr>
+        <w:t>davening</w:t>
+      </w:r>
+      <w:r>
+        <w:rPr>
+          <w:rFonts w:ascii="Times New Roman" w:hAnsi="Times New Roman" w:cs="Times New Roman"/>
+        </w:rPr>
+        <w:t xml:space="preserve"> for it, and we hope to have it. And maybe we </w:t>
+      </w:r>
+      <w:r>
+        <w:rPr>
+          <w:rFonts w:ascii="Times New Roman" w:hAnsi="Times New Roman" w:cs="Times New Roman"/>
+          <w:u w:val="single"/>
+        </w:rPr>
+        <w:t>should</w:t>
+      </w:r>
+      <w:r>
+        <w:rPr>
+          <w:rFonts w:ascii="Times New Roman" w:hAnsi="Times New Roman" w:cs="Times New Roman"/>
+        </w:rPr>
+        <w:t xml:space="preserve"> work on our </w:t>
+      </w:r>
+      <w:r>
+        <w:rPr>
+          <w:rFonts w:ascii="Times New Roman" w:hAnsi="Times New Roman" w:cs="Times New Roman" w:hint="cs"/>
+          <w:rtl/>
+        </w:rPr>
+        <w:t>אמונה</w:t>
+      </w:r>
+      <w:r>
+        <w:rPr>
+          <w:rFonts w:ascii="Times New Roman" w:hAnsi="Times New Roman" w:cs="Times New Roman"/>
+        </w:rPr>
+        <w:t xml:space="preserve"> as well. Anyway, whatever the reason is, we have </w:t>
+      </w:r>
+      <w:r>
+        <w:rPr>
+          <w:rFonts w:ascii="Times New Roman" w:hAnsi="Times New Roman" w:cs="Times New Roman" w:hint="cs"/>
+          <w:rtl/>
+        </w:rPr>
+        <w:t>בטחון</w:t>
+      </w:r>
+      <w:r>
+        <w:rPr>
+          <w:rFonts w:ascii="Times New Roman" w:hAnsi="Times New Roman" w:cs="Times New Roman"/>
+        </w:rPr>
+        <w:t xml:space="preserve"> in </w:t>
+      </w:r>
+      <w:r>
+        <w:rPr>
+          <w:rFonts w:ascii="Times New Roman" w:hAnsi="Times New Roman" w:cs="Times New Roman" w:hint="cs"/>
+          <w:rtl/>
+        </w:rPr>
+        <w:t>הקדוש</w:t>
+      </w:r>
+      <w:r>
+        <w:rPr>
+          <w:rFonts w:ascii="Times New Roman" w:hAnsi="Times New Roman" w:cs="Times New Roman"/>
+          <w:rtl/>
+        </w:rPr>
+        <w:t xml:space="preserve"> </w:t>
+      </w:r>
+      <w:r>
+        <w:rPr>
+          <w:rFonts w:ascii="Times New Roman" w:hAnsi="Times New Roman" w:cs="Times New Roman" w:hint="cs"/>
+          <w:rtl/>
+        </w:rPr>
+        <w:t>ברוך</w:t>
+      </w:r>
+      <w:r>
+        <w:rPr>
+          <w:rFonts w:ascii="Times New Roman" w:hAnsi="Times New Roman" w:cs="Times New Roman"/>
+          <w:rtl/>
+        </w:rPr>
+        <w:t xml:space="preserve"> </w:t>
+      </w:r>
+      <w:r>
+        <w:rPr>
+          <w:rFonts w:ascii="Times New Roman" w:hAnsi="Times New Roman" w:cs="Times New Roman" w:hint="cs"/>
+          <w:rtl/>
+        </w:rPr>
+        <w:t>הוא</w:t>
+      </w:r>
+      <w:r>
+        <w:rPr>
+          <w:rFonts w:ascii="Times New Roman" w:hAnsi="Times New Roman" w:cs="Times New Roman"/>
+        </w:rPr>
+        <w:t xml:space="preserve">, who will find us </w:t>
+      </w:r>
+      <w:r>
+        <w:rPr>
+          <w:rFonts w:ascii="Times New Roman" w:hAnsi="Times New Roman" w:cs="Times New Roman" w:hint="cs"/>
+          <w:rtl/>
+        </w:rPr>
+        <w:t>זכאי</w:t>
+      </w:r>
+      <w:r>
+        <w:rPr>
+          <w:rFonts w:ascii="Times New Roman" w:hAnsi="Times New Roman" w:cs="Times New Roman"/>
+          <w:rtl/>
+        </w:rPr>
+        <w:t xml:space="preserve"> </w:t>
+      </w:r>
+      <w:r>
+        <w:rPr>
+          <w:rFonts w:ascii="Times New Roman" w:hAnsi="Times New Roman" w:cs="Times New Roman" w:hint="cs"/>
+          <w:rtl/>
+        </w:rPr>
+        <w:t>במשפט</w:t>
+      </w:r>
+      <w:r>
+        <w:rPr>
+          <w:rFonts w:ascii="Times New Roman" w:hAnsi="Times New Roman" w:cs="Times New Roman"/>
+        </w:rPr>
+        <w:t>. We made it since last year after all. We</w:t>
+      </w:r>
+      <w:r>
+        <w:rPr>
+          <w:rFonts w:ascii="Times New Roman" w:hAnsi="Times New Roman" w:cs="Times New Roman"/>
+        </w:rPr>
+        <w:t>’</w:t>
+      </w:r>
+      <w:r>
+        <w:rPr>
+          <w:rFonts w:ascii="Times New Roman" w:hAnsi="Times New Roman" w:cs="Times New Roman"/>
+        </w:rPr>
+        <w:t xml:space="preserve">re still here, those of us who are here. </w:t>
+      </w:r>
+      <w:r>
+        <w:rPr>
+          <w:rFonts w:ascii="Times New Roman" w:hAnsi="Times New Roman" w:cs="Times New Roman" w:hint="cs"/>
+          <w:rtl/>
+        </w:rPr>
+        <w:t>נעבעך</w:t>
+      </w:r>
+      <w:r>
+        <w:rPr>
+          <w:rFonts w:ascii="Times New Roman" w:hAnsi="Times New Roman" w:cs="Times New Roman"/>
+          <w:rtl/>
+        </w:rPr>
+        <w:t xml:space="preserve">. </w:t>
+      </w:r>
+      <w:r>
+        <w:rPr>
+          <w:rFonts w:ascii="Times New Roman" w:hAnsi="Times New Roman" w:cs="Times New Roman" w:hint="cs"/>
+          <w:rtl/>
+        </w:rPr>
+        <w:t>איי</w:t>
+      </w:r>
+      <w:r>
+        <w:rPr>
+          <w:rFonts w:ascii="Times New Roman" w:hAnsi="Times New Roman" w:cs="Times New Roman"/>
+          <w:rtl/>
+        </w:rPr>
+        <w:t xml:space="preserve"> </w:t>
+      </w:r>
+      <w:r>
+        <w:rPr>
+          <w:rFonts w:ascii="Times New Roman" w:hAnsi="Times New Roman" w:cs="Times New Roman" w:hint="cs"/>
+          <w:rtl/>
+        </w:rPr>
+        <w:t>איי</w:t>
+      </w:r>
+      <w:r>
+        <w:rPr>
+          <w:rFonts w:ascii="Times New Roman" w:hAnsi="Times New Roman" w:cs="Times New Roman"/>
+          <w:rtl/>
+        </w:rPr>
+        <w:t xml:space="preserve"> </w:t>
+      </w:r>
+      <w:r>
+        <w:rPr>
+          <w:rFonts w:ascii="Times New Roman" w:hAnsi="Times New Roman" w:cs="Times New Roman" w:hint="cs"/>
+          <w:rtl/>
+        </w:rPr>
+        <w:t>איי</w:t>
+      </w:r>
+      <w:r>
+        <w:rPr>
+          <w:rFonts w:ascii="Times New Roman" w:hAnsi="Times New Roman" w:cs="Times New Roman"/>
+        </w:rPr>
+        <w:t xml:space="preserve">. Those of us who are here. We should learn a lesson from those who are not here. </w:t>
+      </w:r>
+      <w:r>
+        <w:rPr>
+          <w:rFonts w:ascii="Times New Roman" w:hAnsi="Times New Roman" w:cs="Times New Roman" w:hint="cs"/>
+          <w:rtl/>
+        </w:rPr>
+        <w:t>איי</w:t>
+      </w:r>
+      <w:r>
+        <w:rPr>
+          <w:rFonts w:ascii="Times New Roman" w:hAnsi="Times New Roman" w:cs="Times New Roman"/>
+          <w:rtl/>
+        </w:rPr>
+        <w:t xml:space="preserve"> </w:t>
+      </w:r>
+      <w:r>
+        <w:rPr>
+          <w:rFonts w:ascii="Times New Roman" w:hAnsi="Times New Roman" w:cs="Times New Roman" w:hint="cs"/>
+          <w:rtl/>
+        </w:rPr>
+        <w:t>איי</w:t>
+      </w:r>
+      <w:r>
+        <w:rPr>
+          <w:rFonts w:ascii="Times New Roman" w:hAnsi="Times New Roman" w:cs="Times New Roman"/>
+          <w:rtl/>
+        </w:rPr>
+        <w:t xml:space="preserve"> </w:t>
+      </w:r>
+      <w:r>
+        <w:rPr>
+          <w:rFonts w:ascii="Times New Roman" w:hAnsi="Times New Roman" w:cs="Times New Roman" w:hint="cs"/>
+          <w:rtl/>
+        </w:rPr>
+        <w:t>איי</w:t>
+      </w:r>
+      <w:r>
+        <w:rPr>
+          <w:rFonts w:ascii="Times New Roman" w:hAnsi="Times New Roman" w:cs="Times New Roman"/>
+        </w:rPr>
+        <w:t xml:space="preserve">. But those of us who are here, so we see that we have </w:t>
+      </w:r>
+      <w:r>
+        <w:rPr>
+          <w:rFonts w:ascii="Times New Roman" w:hAnsi="Times New Roman" w:cs="Times New Roman" w:hint="cs"/>
+          <w:rtl/>
+        </w:rPr>
+        <w:t>אמונה</w:t>
+      </w:r>
+      <w:r>
+        <w:rPr>
+          <w:rFonts w:ascii="Times New Roman" w:hAnsi="Times New Roman" w:cs="Times New Roman"/>
+        </w:rPr>
+        <w:t xml:space="preserve"> that </w:t>
+      </w:r>
+      <w:r>
+        <w:rPr>
+          <w:rFonts w:ascii="Times New Roman" w:hAnsi="Times New Roman" w:cs="Times New Roman" w:hint="cs"/>
+          <w:rtl/>
+        </w:rPr>
+        <w:t>הקדוש</w:t>
+      </w:r>
+      <w:r>
+        <w:rPr>
+          <w:rFonts w:ascii="Times New Roman" w:hAnsi="Times New Roman" w:cs="Times New Roman"/>
+          <w:rtl/>
+        </w:rPr>
+        <w:t xml:space="preserve"> </w:t>
+      </w:r>
+      <w:r>
+        <w:rPr>
+          <w:rFonts w:ascii="Times New Roman" w:hAnsi="Times New Roman" w:cs="Times New Roman" w:hint="cs"/>
+          <w:rtl/>
+        </w:rPr>
+        <w:t>ברוך</w:t>
+      </w:r>
+      <w:r>
+        <w:rPr>
+          <w:rFonts w:ascii="Times New Roman" w:hAnsi="Times New Roman" w:cs="Times New Roman"/>
+          <w:rtl/>
+        </w:rPr>
+        <w:t xml:space="preserve"> </w:t>
+      </w:r>
+      <w:r>
+        <w:rPr>
+          <w:rFonts w:ascii="Times New Roman" w:hAnsi="Times New Roman" w:cs="Times New Roman" w:hint="cs"/>
+          <w:rtl/>
+        </w:rPr>
+        <w:t>הוא</w:t>
+      </w:r>
+      <w:r>
+        <w:rPr>
+          <w:rFonts w:ascii="Times New Roman" w:hAnsi="Times New Roman" w:cs="Times New Roman"/>
+        </w:rPr>
+        <w:t xml:space="preserve"> will find us </w:t>
+      </w:r>
+      <w:r>
+        <w:rPr>
+          <w:rFonts w:ascii="Times New Roman" w:hAnsi="Times New Roman" w:cs="Times New Roman" w:hint="cs"/>
+          <w:rtl/>
+        </w:rPr>
+        <w:t>זכאי</w:t>
+      </w:r>
+      <w:r>
+        <w:rPr>
+          <w:rFonts w:ascii="Times New Roman" w:hAnsi="Times New Roman" w:cs="Times New Roman"/>
+          <w:rtl/>
+        </w:rPr>
+        <w:t xml:space="preserve"> </w:t>
+      </w:r>
+      <w:r>
+        <w:rPr>
+          <w:rFonts w:ascii="Times New Roman" w:hAnsi="Times New Roman" w:cs="Times New Roman" w:hint="cs"/>
+          <w:rtl/>
+        </w:rPr>
+        <w:t>בדין</w:t>
+      </w:r>
+      <w:r>
+        <w:rPr>
+          <w:rFonts w:ascii="Times New Roman" w:hAnsi="Times New Roman" w:cs="Times New Roman"/>
+        </w:rPr>
+        <w:t xml:space="preserve">. </w:t>
       </w:r>
       <w:r>
         <w:rPr>
@@ -1637,738 +2470,7 @@
         <w:rPr>
           <w:rFonts w:ascii="Times New Roman" w:hAnsi="Times New Roman" w:cs="Times New Roman"/>
         </w:rPr>
-        <w:t xml:space="preserve">hese are days of </w:t>
-      </w:r>
-      <w:r>
-        <w:rPr>
-          <w:rFonts w:ascii="Times New Roman" w:hAnsi="Times New Roman" w:cs="Times New Roman" w:hint="cs"/>
-          <w:rtl/>
-        </w:rPr>
-        <w:t>קדושה</w:t>
-      </w:r>
-      <w:r>
-        <w:rPr>
-          <w:rFonts w:ascii="Times New Roman" w:hAnsi="Times New Roman" w:cs="Times New Roman"/>
-        </w:rPr>
-        <w:t xml:space="preserve"> and on days of </w:t>
-      </w:r>
-      <w:r>
-        <w:rPr>
-          <w:rFonts w:ascii="Times New Roman" w:hAnsi="Times New Roman" w:cs="Times New Roman" w:hint="cs"/>
-          <w:rtl/>
-        </w:rPr>
-        <w:t>קדושה</w:t>
-      </w:r>
-      <w:r>
-        <w:rPr>
-          <w:rFonts w:ascii="Times New Roman" w:hAnsi="Times New Roman" w:cs="Times New Roman"/>
-        </w:rPr>
-        <w:t>, it</w:t>
-      </w:r>
-      <w:r>
-        <w:rPr>
-          <w:rFonts w:ascii="Times New Roman" w:hAnsi="Times New Roman" w:cs="Times New Roman"/>
-        </w:rPr>
-        <w:t>’</w:t>
-      </w:r>
-      <w:r>
-        <w:rPr>
-          <w:rFonts w:ascii="Times New Roman" w:hAnsi="Times New Roman" w:cs="Times New Roman"/>
-        </w:rPr>
-        <w:t xml:space="preserve">s our job to say </w:t>
-      </w:r>
-      <w:r>
-        <w:rPr>
-          <w:rFonts w:ascii="Times New Roman" w:hAnsi="Times New Roman" w:cs="Times New Roman" w:hint="cs"/>
-          <w:rtl/>
-        </w:rPr>
-        <w:t>שירה</w:t>
-      </w:r>
-      <w:r>
-        <w:rPr>
-          <w:rFonts w:ascii="Times New Roman" w:hAnsi="Times New Roman" w:cs="Times New Roman"/>
-        </w:rPr>
-        <w:t xml:space="preserve"> before </w:t>
-      </w:r>
-      <w:r>
-        <w:rPr>
-          <w:rFonts w:ascii="Times New Roman" w:hAnsi="Times New Roman" w:cs="Times New Roman"/>
-        </w:rPr>
-        <w:t>Hashem</w:t>
-      </w:r>
-      <w:r>
-        <w:rPr>
-          <w:rFonts w:ascii="Times New Roman" w:hAnsi="Times New Roman" w:cs="Times New Roman"/>
-        </w:rPr>
-        <w:t xml:space="preserve">. </w:t>
-      </w:r>
-      <w:r>
-        <w:rPr>
-          <w:rFonts w:ascii="Times New Roman" w:hAnsi="Times New Roman" w:cs="Times New Roman"/>
-        </w:rPr>
-        <w:t>Hashem</w:t>
-      </w:r>
-      <w:r>
-        <w:rPr>
-          <w:rFonts w:ascii="Times New Roman" w:hAnsi="Times New Roman" w:cs="Times New Roman"/>
-        </w:rPr>
-        <w:t xml:space="preserve"> answered them and said the answer which we all know</w:t>
-      </w:r>
-      <w:r>
-        <w:rPr>
-          <w:rFonts w:ascii="Times New Roman" w:hAnsi="Times New Roman" w:cs="Times New Roman"/>
-        </w:rPr>
-        <w:t>:</w:t>
-      </w:r>
-      <w:r>
-        <w:rPr>
-          <w:rFonts w:ascii="Times New Roman" w:hAnsi="Times New Roman" w:cs="Times New Roman" w:hint="cs"/>
-          <w:rtl/>
-        </w:rPr>
-        <w:t>אֶפְשָׁר</w:t>
-      </w:r>
-      <w:r>
-        <w:rPr>
-          <w:rFonts w:ascii="Times New Roman" w:hAnsi="Times New Roman" w:cs="Times New Roman"/>
-          <w:rtl/>
-        </w:rPr>
-        <w:t xml:space="preserve"> </w:t>
-      </w:r>
-      <w:r>
-        <w:rPr>
-          <w:rFonts w:ascii="Times New Roman" w:hAnsi="Times New Roman" w:cs="Times New Roman" w:hint="cs"/>
-          <w:rtl/>
-        </w:rPr>
-        <w:t>מֶלֶךְ</w:t>
-      </w:r>
-      <w:r>
-        <w:rPr>
-          <w:rFonts w:ascii="Times New Roman" w:hAnsi="Times New Roman" w:cs="Times New Roman"/>
-          <w:rtl/>
-        </w:rPr>
-        <w:t xml:space="preserve"> </w:t>
-      </w:r>
-      <w:r>
-        <w:rPr>
-          <w:rFonts w:ascii="Times New Roman" w:hAnsi="Times New Roman" w:cs="Times New Roman" w:hint="cs"/>
-          <w:rtl/>
-        </w:rPr>
-        <w:t>יוֹשֵׁב</w:t>
-      </w:r>
-      <w:r>
-        <w:rPr>
-          <w:rFonts w:ascii="Times New Roman" w:hAnsi="Times New Roman" w:cs="Times New Roman"/>
-          <w:rtl/>
-        </w:rPr>
-        <w:t xml:space="preserve"> </w:t>
-      </w:r>
-      <w:r>
-        <w:rPr>
-          <w:rFonts w:ascii="Times New Roman" w:hAnsi="Times New Roman" w:cs="Times New Roman" w:hint="cs"/>
-          <w:rtl/>
-        </w:rPr>
-        <w:t>עַל</w:t>
-      </w:r>
-      <w:r>
-        <w:rPr>
-          <w:rFonts w:ascii="Times New Roman" w:hAnsi="Times New Roman" w:cs="Times New Roman"/>
-          <w:rtl/>
-        </w:rPr>
-        <w:t xml:space="preserve"> </w:t>
-      </w:r>
-      <w:r>
-        <w:rPr>
-          <w:rFonts w:ascii="Times New Roman" w:hAnsi="Times New Roman" w:cs="Times New Roman" w:hint="cs"/>
-          <w:rtl/>
-        </w:rPr>
-        <w:t>כִּסֵּא</w:t>
-      </w:r>
-      <w:r>
-        <w:rPr>
-          <w:rFonts w:ascii="Times New Roman" w:hAnsi="Times New Roman" w:cs="Times New Roman"/>
-          <w:rtl/>
-        </w:rPr>
-        <w:t xml:space="preserve"> </w:t>
-      </w:r>
-      <w:r>
-        <w:rPr>
-          <w:rFonts w:ascii="Times New Roman" w:hAnsi="Times New Roman" w:cs="Times New Roman" w:hint="cs"/>
-          <w:rtl/>
-        </w:rPr>
-        <w:t>דִין</w:t>
-      </w:r>
-      <w:r>
-        <w:rPr>
-          <w:rFonts w:ascii="Times New Roman" w:hAnsi="Times New Roman" w:cs="Times New Roman"/>
-          <w:rtl/>
-        </w:rPr>
-        <w:t xml:space="preserve">, </w:t>
-      </w:r>
-      <w:r>
-        <w:rPr>
-          <w:rFonts w:ascii="Times New Roman" w:hAnsi="Times New Roman" w:cs="Times New Roman" w:hint="cs"/>
-          <w:rtl/>
-        </w:rPr>
-        <w:t>וְסִפְרֵי</w:t>
-      </w:r>
-      <w:r>
-        <w:rPr>
-          <w:rFonts w:ascii="Times New Roman" w:hAnsi="Times New Roman" w:cs="Times New Roman"/>
-          <w:rtl/>
-        </w:rPr>
-        <w:t xml:space="preserve"> </w:t>
-      </w:r>
-      <w:r>
-        <w:rPr>
-          <w:rFonts w:ascii="Times New Roman" w:hAnsi="Times New Roman" w:cs="Times New Roman" w:hint="cs"/>
-          <w:rtl/>
-        </w:rPr>
-        <w:t>חַיִּים</w:t>
-      </w:r>
-      <w:r>
-        <w:rPr>
-          <w:rFonts w:ascii="Times New Roman" w:hAnsi="Times New Roman" w:cs="Times New Roman"/>
-          <w:rtl/>
-        </w:rPr>
-        <w:t xml:space="preserve"> </w:t>
-      </w:r>
-      <w:r>
-        <w:rPr>
-          <w:rFonts w:ascii="Times New Roman" w:hAnsi="Times New Roman" w:cs="Times New Roman" w:hint="cs"/>
-          <w:rtl/>
-        </w:rPr>
-        <w:t>וְסִפְרֵי</w:t>
-      </w:r>
-      <w:r>
-        <w:rPr>
-          <w:rFonts w:ascii="Times New Roman" w:hAnsi="Times New Roman" w:cs="Times New Roman"/>
-          <w:rtl/>
-        </w:rPr>
-        <w:t xml:space="preserve"> </w:t>
-      </w:r>
-      <w:r>
-        <w:rPr>
-          <w:rFonts w:ascii="Times New Roman" w:hAnsi="Times New Roman" w:cs="Times New Roman" w:hint="cs"/>
-          <w:rtl/>
-        </w:rPr>
-        <w:t>מֵתִים</w:t>
-      </w:r>
-      <w:r>
-        <w:rPr>
-          <w:rFonts w:ascii="Times New Roman" w:hAnsi="Times New Roman" w:cs="Times New Roman"/>
-          <w:rtl/>
-        </w:rPr>
-        <w:t xml:space="preserve"> </w:t>
-      </w:r>
-      <w:r>
-        <w:rPr>
-          <w:rFonts w:ascii="Times New Roman" w:hAnsi="Times New Roman" w:cs="Times New Roman" w:hint="cs"/>
-          <w:rtl/>
-        </w:rPr>
-        <w:t>פְּתוּחִין</w:t>
-      </w:r>
-      <w:r>
-        <w:rPr>
-          <w:rFonts w:ascii="Times New Roman" w:hAnsi="Times New Roman" w:cs="Times New Roman"/>
-          <w:rtl/>
-        </w:rPr>
-        <w:t xml:space="preserve"> </w:t>
-      </w:r>
-      <w:r>
-        <w:rPr>
-          <w:rFonts w:ascii="Times New Roman" w:hAnsi="Times New Roman" w:cs="Times New Roman" w:hint="cs"/>
-          <w:rtl/>
-        </w:rPr>
-        <w:t>לְפָנָיו</w:t>
-      </w:r>
-      <w:r>
-        <w:rPr>
-          <w:rFonts w:ascii="Times New Roman" w:hAnsi="Times New Roman" w:cs="Times New Roman"/>
-        </w:rPr>
-        <w:t xml:space="preserve">? </w:t>
-      </w:r>
-      <w:r>
-        <w:rPr>
-          <w:rFonts w:ascii="Times New Roman" w:hAnsi="Times New Roman" w:cs="Times New Roman"/>
-        </w:rPr>
-        <w:t xml:space="preserve">- </w:t>
-      </w:r>
-      <w:r>
-        <w:rPr>
-          <w:rFonts w:ascii="Times New Roman" w:hAnsi="Times New Roman" w:cs="Times New Roman"/>
-        </w:rPr>
-        <w:t>The book of life and the book of death is open in front of the king who</w:t>
-      </w:r>
-      <w:r>
-        <w:rPr>
-          <w:rFonts w:ascii="Times New Roman" w:hAnsi="Times New Roman" w:cs="Times New Roman"/>
-        </w:rPr>
-        <w:t>’</w:t>
-      </w:r>
-      <w:r>
-        <w:rPr>
-          <w:rFonts w:ascii="Times New Roman" w:hAnsi="Times New Roman" w:cs="Times New Roman"/>
-        </w:rPr>
-        <w:t>s about to make a judgment</w:t>
-      </w:r>
-      <w:r>
-        <w:rPr>
-          <w:rFonts w:ascii="Times New Roman" w:hAnsi="Times New Roman" w:cs="Times New Roman"/>
-        </w:rPr>
-        <w:t xml:space="preserve">; </w:t>
-      </w:r>
-      <w:r>
-        <w:rPr>
-          <w:rFonts w:ascii="Times New Roman" w:hAnsi="Times New Roman" w:cs="Times New Roman" w:hint="cs"/>
-          <w:rtl/>
-        </w:rPr>
-        <w:t>וְיִשְׂרָאֵל</w:t>
-      </w:r>
-      <w:r>
-        <w:rPr>
-          <w:rFonts w:ascii="Times New Roman" w:hAnsi="Times New Roman" w:cs="Times New Roman"/>
-          <w:rtl/>
-        </w:rPr>
-        <w:t xml:space="preserve"> </w:t>
-      </w:r>
-      <w:r>
-        <w:rPr>
-          <w:rFonts w:ascii="Times New Roman" w:hAnsi="Times New Roman" w:cs="Times New Roman" w:hint="cs"/>
-          <w:rtl/>
-        </w:rPr>
-        <w:t>אוֹמְרִים</w:t>
-      </w:r>
-      <w:r>
-        <w:rPr>
-          <w:rFonts w:ascii="Times New Roman" w:hAnsi="Times New Roman" w:cs="Times New Roman"/>
-          <w:rtl/>
-        </w:rPr>
-        <w:t xml:space="preserve"> </w:t>
-      </w:r>
-      <w:r>
-        <w:rPr>
-          <w:rFonts w:ascii="Times New Roman" w:hAnsi="Times New Roman" w:cs="Times New Roman" w:hint="cs"/>
-          <w:rtl/>
-        </w:rPr>
-        <w:t>שִׁירָה</w:t>
-      </w:r>
-      <w:r>
-        <w:rPr>
-          <w:rFonts w:ascii="Times New Roman" w:hAnsi="Times New Roman" w:cs="Times New Roman"/>
-        </w:rPr>
-        <w:t xml:space="preserve">? </w:t>
-      </w:r>
-      <w:r>
-        <w:rPr>
-          <w:rFonts w:ascii="Times New Roman" w:hAnsi="Times New Roman" w:cs="Times New Roman"/>
-        </w:rPr>
-        <w:t>I</w:t>
-      </w:r>
-      <w:r>
-        <w:rPr>
-          <w:rFonts w:ascii="Times New Roman" w:hAnsi="Times New Roman" w:cs="Times New Roman"/>
-        </w:rPr>
-        <w:t xml:space="preserve">n that </w:t>
-      </w:r>
-      <w:r>
-        <w:rPr>
-          <w:rFonts w:ascii="Times New Roman" w:hAnsi="Times New Roman" w:cs="Times New Roman"/>
-        </w:rPr>
-        <w:t>Gemara</w:t>
-      </w:r>
-      <w:r>
-        <w:rPr>
-          <w:rFonts w:ascii="Times New Roman" w:hAnsi="Times New Roman" w:cs="Times New Roman"/>
-        </w:rPr>
-        <w:t>, there</w:t>
-      </w:r>
-      <w:r>
-        <w:rPr>
-          <w:rFonts w:ascii="Times New Roman" w:hAnsi="Times New Roman" w:cs="Times New Roman"/>
-        </w:rPr>
-        <w:t>’</w:t>
-      </w:r>
-      <w:r>
-        <w:rPr>
-          <w:rFonts w:ascii="Times New Roman" w:hAnsi="Times New Roman" w:cs="Times New Roman"/>
-        </w:rPr>
-        <w:t xml:space="preserve">s a famous </w:t>
-      </w:r>
-      <w:r>
-        <w:rPr>
-          <w:rFonts w:ascii="Times New Roman" w:hAnsi="Times New Roman" w:cs="Times New Roman" w:hint="cs"/>
-          <w:rtl/>
-        </w:rPr>
-        <w:t>שאלה</w:t>
-      </w:r>
-      <w:r>
-        <w:rPr>
-          <w:rFonts w:ascii="Times New Roman" w:hAnsi="Times New Roman" w:cs="Times New Roman"/>
-        </w:rPr>
-        <w:t xml:space="preserve">: </w:t>
-      </w:r>
-      <w:r>
-        <w:rPr>
-          <w:rFonts w:ascii="Times New Roman" w:hAnsi="Times New Roman" w:cs="Times New Roman"/>
-        </w:rPr>
-        <w:t>We know and we count upon, we look forward to</w:t>
-      </w:r>
-      <w:r>
-        <w:rPr>
-          <w:rFonts w:ascii="Times New Roman" w:hAnsi="Times New Roman" w:cs="Times New Roman"/>
-        </w:rPr>
-        <w:t xml:space="preserve"> Hashem</w:t>
-      </w:r>
-      <w:r>
-        <w:rPr>
-          <w:rFonts w:ascii="Times New Roman" w:hAnsi="Times New Roman" w:cs="Times New Roman"/>
-        </w:rPr>
-        <w:t>’</w:t>
-      </w:r>
-      <w:r>
-        <w:rPr>
-          <w:rFonts w:ascii="Times New Roman" w:hAnsi="Times New Roman" w:cs="Times New Roman"/>
-        </w:rPr>
-        <w:t>s</w:t>
-      </w:r>
-      <w:r>
-        <w:rPr>
-          <w:rFonts w:ascii="Times New Roman" w:hAnsi="Times New Roman" w:cs="Times New Roman"/>
-        </w:rPr>
-        <w:t xml:space="preserve"> </w:t>
-      </w:r>
-      <w:r>
-        <w:rPr>
-          <w:rFonts w:ascii="Times New Roman" w:hAnsi="Times New Roman" w:cs="Times New Roman" w:hint="cs"/>
-          <w:rtl/>
-        </w:rPr>
-        <w:t>חסד</w:t>
-      </w:r>
-      <w:r>
-        <w:rPr>
-          <w:rFonts w:ascii="Times New Roman" w:hAnsi="Times New Roman" w:cs="Times New Roman"/>
-        </w:rPr>
-        <w:t xml:space="preserve">. We have tremendous </w:t>
-      </w:r>
-      <w:r>
-        <w:rPr>
-          <w:rFonts w:ascii="Times New Roman" w:hAnsi="Times New Roman" w:cs="Times New Roman" w:hint="cs"/>
-          <w:rtl/>
-        </w:rPr>
-        <w:t>אמונה</w:t>
-      </w:r>
-      <w:r>
-        <w:rPr>
-          <w:rFonts w:ascii="Times New Roman" w:hAnsi="Times New Roman" w:cs="Times New Roman"/>
-        </w:rPr>
-        <w:t>, not because we deserve it, but because we</w:t>
-      </w:r>
-      <w:r>
-        <w:rPr>
-          <w:rFonts w:ascii="Times New Roman" w:hAnsi="Times New Roman" w:cs="Times New Roman"/>
-        </w:rPr>
-        <w:t>’</w:t>
-      </w:r>
-      <w:r>
-        <w:rPr>
-          <w:rFonts w:ascii="Times New Roman" w:hAnsi="Times New Roman" w:cs="Times New Roman"/>
-        </w:rPr>
-        <w:t xml:space="preserve">re </w:t>
-      </w:r>
-      <w:r>
-        <w:rPr>
-          <w:rFonts w:ascii="Times New Roman" w:hAnsi="Times New Roman" w:cs="Times New Roman"/>
-        </w:rPr>
-        <w:t>davening</w:t>
-      </w:r>
-      <w:r>
-        <w:rPr>
-          <w:rFonts w:ascii="Times New Roman" w:hAnsi="Times New Roman" w:cs="Times New Roman"/>
-        </w:rPr>
-        <w:t xml:space="preserve"> for it, and we hope to have it. And maybe we should work on our </w:t>
-      </w:r>
-      <w:r>
-        <w:rPr>
-          <w:rFonts w:ascii="Times New Roman" w:hAnsi="Times New Roman" w:cs="Times New Roman" w:hint="cs"/>
-          <w:rtl/>
-        </w:rPr>
-        <w:t>אמונה</w:t>
-      </w:r>
-      <w:r>
-        <w:rPr>
-          <w:rFonts w:ascii="Times New Roman" w:hAnsi="Times New Roman" w:cs="Times New Roman"/>
-        </w:rPr>
-        <w:t xml:space="preserve"> as well. Anyway, whatever the reason is, we have </w:t>
-      </w:r>
-      <w:r>
-        <w:rPr>
-          <w:rFonts w:ascii="Times New Roman" w:hAnsi="Times New Roman" w:cs="Times New Roman" w:hint="cs"/>
-          <w:rtl/>
-        </w:rPr>
-        <w:t>בטחון</w:t>
-      </w:r>
-      <w:r>
-        <w:rPr>
-          <w:rFonts w:ascii="Times New Roman" w:hAnsi="Times New Roman" w:cs="Times New Roman"/>
-        </w:rPr>
-        <w:t xml:space="preserve"> in </w:t>
-      </w:r>
-      <w:r>
-        <w:rPr>
-          <w:rFonts w:ascii="Times New Roman" w:hAnsi="Times New Roman" w:cs="Times New Roman" w:hint="cs"/>
-          <w:rtl/>
-        </w:rPr>
-        <w:t>הקדוש</w:t>
-      </w:r>
-      <w:r>
-        <w:rPr>
-          <w:rFonts w:ascii="Times New Roman" w:hAnsi="Times New Roman" w:cs="Times New Roman"/>
-          <w:rtl/>
-        </w:rPr>
-        <w:t xml:space="preserve"> </w:t>
-      </w:r>
-      <w:r>
-        <w:rPr>
-          <w:rFonts w:ascii="Times New Roman" w:hAnsi="Times New Roman" w:cs="Times New Roman" w:hint="cs"/>
-          <w:rtl/>
-        </w:rPr>
-        <w:t>ברוך</w:t>
-      </w:r>
-      <w:r>
-        <w:rPr>
-          <w:rFonts w:ascii="Times New Roman" w:hAnsi="Times New Roman" w:cs="Times New Roman"/>
-          <w:rtl/>
-        </w:rPr>
-        <w:t xml:space="preserve"> </w:t>
-      </w:r>
-      <w:r>
-        <w:rPr>
-          <w:rFonts w:ascii="Times New Roman" w:hAnsi="Times New Roman" w:cs="Times New Roman" w:hint="cs"/>
-          <w:rtl/>
-        </w:rPr>
-        <w:t>הוא</w:t>
-      </w:r>
-      <w:r>
-        <w:rPr>
-          <w:rFonts w:ascii="Times New Roman" w:hAnsi="Times New Roman" w:cs="Times New Roman"/>
-        </w:rPr>
-        <w:t xml:space="preserve">, who will find us </w:t>
-      </w:r>
-      <w:r>
-        <w:rPr>
-          <w:rFonts w:ascii="Times New Roman" w:hAnsi="Times New Roman" w:cs="Times New Roman" w:hint="cs"/>
-          <w:rtl/>
-        </w:rPr>
-        <w:t>זכאי</w:t>
-      </w:r>
-      <w:r>
-        <w:rPr>
-          <w:rFonts w:ascii="Times New Roman" w:hAnsi="Times New Roman" w:cs="Times New Roman"/>
-          <w:rtl/>
-        </w:rPr>
-        <w:t xml:space="preserve"> </w:t>
-      </w:r>
-      <w:r>
-        <w:rPr>
-          <w:rFonts w:ascii="Times New Roman" w:hAnsi="Times New Roman" w:cs="Times New Roman" w:hint="cs"/>
-          <w:rtl/>
-        </w:rPr>
-        <w:t>במשפט</w:t>
-      </w:r>
-      <w:r>
-        <w:rPr>
-          <w:rFonts w:ascii="Times New Roman" w:hAnsi="Times New Roman" w:cs="Times New Roman"/>
-        </w:rPr>
-        <w:t>. We made it since last year after all. We</w:t>
-      </w:r>
-      <w:r>
-        <w:rPr>
-          <w:rFonts w:ascii="Times New Roman" w:hAnsi="Times New Roman" w:cs="Times New Roman"/>
-        </w:rPr>
-        <w:t>’</w:t>
-      </w:r>
-      <w:r>
-        <w:rPr>
-          <w:rFonts w:ascii="Times New Roman" w:hAnsi="Times New Roman" w:cs="Times New Roman"/>
-        </w:rPr>
-        <w:t xml:space="preserve">re still here, those of us who are here. </w:t>
-      </w:r>
-      <w:r>
-        <w:rPr>
-          <w:rFonts w:ascii="Times New Roman" w:hAnsi="Times New Roman" w:cs="Times New Roman" w:hint="cs"/>
-          <w:rtl/>
-        </w:rPr>
-        <w:t>נעבעך</w:t>
-      </w:r>
-      <w:r>
-        <w:rPr>
-          <w:rFonts w:ascii="Times New Roman" w:hAnsi="Times New Roman" w:cs="Times New Roman"/>
-          <w:rtl/>
-        </w:rPr>
-        <w:t xml:space="preserve">. </w:t>
-      </w:r>
-      <w:r>
-        <w:rPr>
-          <w:rFonts w:ascii="Times New Roman" w:hAnsi="Times New Roman" w:cs="Times New Roman" w:hint="cs"/>
-          <w:rtl/>
-        </w:rPr>
-        <w:t>איי</w:t>
-      </w:r>
-      <w:r>
-        <w:rPr>
-          <w:rFonts w:ascii="Times New Roman" w:hAnsi="Times New Roman" w:cs="Times New Roman"/>
-          <w:rtl/>
-        </w:rPr>
-        <w:t xml:space="preserve"> </w:t>
-      </w:r>
-      <w:r>
-        <w:rPr>
-          <w:rFonts w:ascii="Times New Roman" w:hAnsi="Times New Roman" w:cs="Times New Roman" w:hint="cs"/>
-          <w:rtl/>
-        </w:rPr>
-        <w:t>איי</w:t>
-      </w:r>
-      <w:r>
-        <w:rPr>
-          <w:rFonts w:ascii="Times New Roman" w:hAnsi="Times New Roman" w:cs="Times New Roman"/>
-          <w:rtl/>
-        </w:rPr>
-        <w:t xml:space="preserve"> </w:t>
-      </w:r>
-      <w:r>
-        <w:rPr>
-          <w:rFonts w:ascii="Times New Roman" w:hAnsi="Times New Roman" w:cs="Times New Roman" w:hint="cs"/>
-          <w:rtl/>
-        </w:rPr>
-        <w:t>איי</w:t>
-      </w:r>
-      <w:r>
-        <w:rPr>
-          <w:rFonts w:ascii="Times New Roman" w:hAnsi="Times New Roman" w:cs="Times New Roman"/>
-        </w:rPr>
-        <w:t xml:space="preserve">. Those of us who are here. We should learn a lesson from those who are not here. </w:t>
-      </w:r>
-      <w:r>
-        <w:rPr>
-          <w:rFonts w:ascii="Times New Roman" w:hAnsi="Times New Roman" w:cs="Times New Roman" w:hint="cs"/>
-          <w:rtl/>
-        </w:rPr>
-        <w:t>איי</w:t>
-      </w:r>
-      <w:r>
-        <w:rPr>
-          <w:rFonts w:ascii="Times New Roman" w:hAnsi="Times New Roman" w:cs="Times New Roman"/>
-          <w:rtl/>
-        </w:rPr>
-        <w:t xml:space="preserve"> </w:t>
-      </w:r>
-      <w:r>
-        <w:rPr>
-          <w:rFonts w:ascii="Times New Roman" w:hAnsi="Times New Roman" w:cs="Times New Roman" w:hint="cs"/>
-          <w:rtl/>
-        </w:rPr>
-        <w:t>איי</w:t>
-      </w:r>
-      <w:r>
-        <w:rPr>
-          <w:rFonts w:ascii="Times New Roman" w:hAnsi="Times New Roman" w:cs="Times New Roman"/>
-          <w:rtl/>
-        </w:rPr>
-        <w:t xml:space="preserve"> </w:t>
-      </w:r>
-      <w:r>
-        <w:rPr>
-          <w:rFonts w:ascii="Times New Roman" w:hAnsi="Times New Roman" w:cs="Times New Roman" w:hint="cs"/>
-          <w:rtl/>
-        </w:rPr>
-        <w:t>איי</w:t>
-      </w:r>
-      <w:r>
-        <w:rPr>
-          <w:rFonts w:ascii="Times New Roman" w:hAnsi="Times New Roman" w:cs="Times New Roman"/>
-        </w:rPr>
-        <w:t xml:space="preserve">. But those of us who are here, so we see that we have </w:t>
-      </w:r>
-      <w:r>
-        <w:rPr>
-          <w:rFonts w:ascii="Times New Roman" w:hAnsi="Times New Roman" w:cs="Times New Roman" w:hint="cs"/>
-          <w:rtl/>
-        </w:rPr>
-        <w:t>אמונה</w:t>
-      </w:r>
-      <w:r>
-        <w:rPr>
-          <w:rFonts w:ascii="Times New Roman" w:hAnsi="Times New Roman" w:cs="Times New Roman"/>
-        </w:rPr>
-        <w:t xml:space="preserve"> that </w:t>
-      </w:r>
-      <w:r>
-        <w:rPr>
-          <w:rFonts w:ascii="Times New Roman" w:hAnsi="Times New Roman" w:cs="Times New Roman" w:hint="cs"/>
-          <w:rtl/>
-        </w:rPr>
-        <w:t>הקדוש</w:t>
-      </w:r>
-      <w:r>
-        <w:rPr>
-          <w:rFonts w:ascii="Times New Roman" w:hAnsi="Times New Roman" w:cs="Times New Roman"/>
-          <w:rtl/>
-        </w:rPr>
-        <w:t xml:space="preserve"> </w:t>
-      </w:r>
-      <w:r>
-        <w:rPr>
-          <w:rFonts w:ascii="Times New Roman" w:hAnsi="Times New Roman" w:cs="Times New Roman" w:hint="cs"/>
-          <w:rtl/>
-        </w:rPr>
-        <w:t>ברוך</w:t>
-      </w:r>
-      <w:r>
-        <w:rPr>
-          <w:rFonts w:ascii="Times New Roman" w:hAnsi="Times New Roman" w:cs="Times New Roman"/>
-          <w:rtl/>
-        </w:rPr>
-        <w:t xml:space="preserve"> </w:t>
-      </w:r>
-      <w:r>
-        <w:rPr>
-          <w:rFonts w:ascii="Times New Roman" w:hAnsi="Times New Roman" w:cs="Times New Roman" w:hint="cs"/>
-          <w:rtl/>
-        </w:rPr>
-        <w:t>הוא</w:t>
-      </w:r>
-      <w:r>
-        <w:rPr>
-          <w:rFonts w:ascii="Times New Roman" w:hAnsi="Times New Roman" w:cs="Times New Roman"/>
-        </w:rPr>
-        <w:t xml:space="preserve"> will find us </w:t>
-      </w:r>
-      <w:r>
-        <w:rPr>
-          <w:rFonts w:ascii="Times New Roman" w:hAnsi="Times New Roman" w:cs="Times New Roman" w:hint="cs"/>
-          <w:rtl/>
-        </w:rPr>
-        <w:t>זכאי</w:t>
-      </w:r>
-      <w:r>
-        <w:rPr>
-          <w:rFonts w:ascii="Times New Roman" w:hAnsi="Times New Roman" w:cs="Times New Roman"/>
-          <w:rtl/>
-        </w:rPr>
-        <w:t xml:space="preserve"> </w:t>
-      </w:r>
-      <w:r>
-        <w:rPr>
-          <w:rFonts w:ascii="Times New Roman" w:hAnsi="Times New Roman" w:cs="Times New Roman" w:hint="cs"/>
-          <w:rtl/>
-        </w:rPr>
-        <w:t>בדין</w:t>
-      </w:r>
-      <w:r>
-        <w:rPr>
-          <w:rFonts w:ascii="Times New Roman" w:hAnsi="Times New Roman" w:cs="Times New Roman"/>
-        </w:rPr>
-        <w:t xml:space="preserve">. So therefore, we should be saying </w:t>
+        <w:t xml:space="preserve">herefore, we should be saying </w:t>
       </w:r>
       <w:r>
         <w:rPr>
@@ -2535,7 +2637,7 @@
         <w:rPr>
           <w:rFonts w:ascii="Times New Roman" w:hAnsi="Times New Roman" w:cs="Times New Roman"/>
         </w:rPr>
-        <w:t xml:space="preserve">e gives a very interesting answer. What are the last three letters of the first three words in the </w:t>
+        <w:t xml:space="preserve">e gives a interesting answer. What are the last three letters of the first three words in the </w:t>
       </w:r>
       <w:r>
         <w:rPr>
@@ -3118,7 +3220,31 @@
         <w:rPr>
           <w:rFonts w:ascii="Times New Roman" w:hAnsi="Times New Roman" w:cs="Times New Roman"/>
         </w:rPr>
-        <w:t xml:space="preserve">. If you have the proper </w:t>
+        <w:t xml:space="preserve">. </w:t>
+      </w:r>
+      <w:r>
+        <w:rPr>
+          <w:rFonts w:ascii="Times New Roman" w:hAnsi="Times New Roman" w:cs="Times New Roman"/>
+        </w:rPr>
+        <w:t>Y</w:t>
+      </w:r>
+      <w:r>
+        <w:rPr>
+          <w:rFonts w:ascii="Times New Roman" w:hAnsi="Times New Roman" w:cs="Times New Roman"/>
+        </w:rPr>
+        <w:t>ou have</w:t>
+      </w:r>
+      <w:r>
+        <w:rPr>
+          <w:rFonts w:ascii="Times New Roman" w:hAnsi="Times New Roman" w:cs="Times New Roman"/>
+        </w:rPr>
+        <w:t xml:space="preserve"> to have</w:t>
+      </w:r>
+      <w:r>
+        <w:rPr>
+          <w:rFonts w:ascii="Times New Roman" w:hAnsi="Times New Roman" w:cs="Times New Roman"/>
+        </w:rPr>
+        <w:t xml:space="preserve"> the proper </w:t>
       </w:r>
       <w:r>
         <w:rPr>

</xml_diff>